<commit_message>
Affiliations: shared Division for first three authors; mark G. Naveen Sundar as corresponding author
Co-Authored-By: Claude Sonnet 5.5 <noreply@anthropic.com>
</commit_message>
<xml_diff>
--- a/paper/TCSST_manuscript_corrected.docx
+++ b/paper/TCSST_manuscript_corrected.docx
@@ -85,7 +85,7 @@
           <w:sz w:val="32"/>
           <w:vertAlign w:val="superscript"/>
         </w:rPr>
-        <w:t>2</w:t>
+        <w:t>1,*</w:t>
       </w:r>
       <w:r>
         <w:rPr>
@@ -110,7 +110,7 @@
           <w:sz w:val="32"/>
           <w:vertAlign w:val="superscript"/>
         </w:rPr>
-        <w:t>3</w:t>
+        <w:t>2</w:t>
       </w:r>
       <w:r>
         <w:rPr>
@@ -135,7 +135,7 @@
           <w:sz w:val="32"/>
           <w:vertAlign w:val="superscript"/>
         </w:rPr>
-        <w:t>*</w:t>
+        <w:t>†</w:t>
       </w:r>
     </w:p>
     <w:p>
@@ -156,12 +156,12 @@
           <w:rFonts w:ascii="Times New Roman" w:hAnsi="Times New Roman" w:cs="Times New Roman" w:eastAsia="Times New Roman"/>
           <w:sz w:val="22"/>
         </w:rPr>
-        <w:t>Department of Computer Science and Engineering, Karunya Institute of Technology and Sciences, Coimbatore, India</w:t>
+        <w:t>Division of Computer Science and Engineering, Karunya Institute of Technology and Sciences, Coimbatore, Tamil Nadu, India</w:t>
       </w:r>
     </w:p>
     <w:p>
       <w:pPr>
-        <w:spacing w:line="259" w:lineRule="auto" w:after="0"/>
+        <w:spacing w:line="259" w:lineRule="auto" w:after="160"/>
         <w:jc w:val="both"/>
       </w:pPr>
       <w:r>
@@ -171,27 +171,6 @@
           <w:vertAlign w:val="superscript"/>
         </w:rPr>
         <w:t>2</w:t>
-      </w:r>
-      <w:r>
-        <w:rPr>
-          <w:rFonts w:ascii="Times New Roman" w:hAnsi="Times New Roman" w:cs="Times New Roman" w:eastAsia="Times New Roman"/>
-          <w:sz w:val="22"/>
-        </w:rPr>
-        <w:t>Division of Computer Science and Engineering, Karunya Institute of Technology and Sciences, Coimbatore, Tamil Nadu, India</w:t>
-      </w:r>
-    </w:p>
-    <w:p>
-      <w:pPr>
-        <w:spacing w:line="259" w:lineRule="auto" w:after="160"/>
-        <w:jc w:val="both"/>
-      </w:pPr>
-      <w:r>
-        <w:rPr>
-          <w:rFonts w:ascii="Times New Roman" w:hAnsi="Times New Roman" w:cs="Times New Roman" w:eastAsia="Times New Roman"/>
-          <w:sz w:val="22"/>
-          <w:vertAlign w:val="superscript"/>
-        </w:rPr>
-        <w:t>3</w:t>
       </w:r>
       <w:r>
         <w:rPr>
@@ -264,7 +243,7 @@
           <w:sz w:val="18"/>
           <w:vertAlign w:val="superscript"/>
         </w:rPr>
-        <w:t>2</w:t>
+        <w:t>1,*</w:t>
       </w:r>
       <w:r>
         <w:rPr>
@@ -286,7 +265,7 @@
           <w:sz w:val="18"/>
           <w:vertAlign w:val="superscript"/>
         </w:rPr>
-        <w:t>3</w:t>
+        <w:t>2</w:t>
       </w:r>
       <w:r>
         <w:rPr>
@@ -298,15 +277,36 @@
     </w:p>
     <w:p>
       <w:pPr>
-        <w:spacing w:line="240" w:lineRule="auto" w:before="120"/>
+        <w:spacing w:line="240" w:lineRule="auto" w:before="40"/>
         <w:jc w:val="left"/>
       </w:pPr>
+      <w:r>
+        <w:rPr>
+          <w:rFonts w:ascii="Times New Roman" w:hAnsi="Times New Roman" w:cs="Times New Roman" w:eastAsia="Times New Roman"/>
+          <w:sz w:val="18"/>
+          <w:vertAlign w:val="superscript"/>
+        </w:rPr>
+        <w:t>*</w:t>
+      </w:r>
       <w:r>
         <w:rPr>
           <w:rFonts w:ascii="Times New Roman" w:hAnsi="Times New Roman" w:cs="Times New Roman" w:eastAsia="Times New Roman"/>
           <w:sz w:val="18"/>
         </w:rPr>
-        <w:t xml:space="preserve">*Data used in preparation of this article were obtained from the Alzheimer’s Disease Neuroimaging Initiative (ADNI) database (adni.loni.usc.edu). As such, the investigators within the ADNI contributed to the design and implementation of ADNI and/or provided data but did not participate in analysis or writing of this report. A complete listing of ADNI investigators can be found at: </w:t>
+        <w:t>Corresponding author: G. Naveen Sundar (naveensundar@karunya.edu)</w:t>
+      </w:r>
+    </w:p>
+    <w:p>
+      <w:pPr>
+        <w:spacing w:line="240" w:lineRule="auto" w:before="120"/>
+        <w:jc w:val="left"/>
+      </w:pPr>
+      <w:r>
+        <w:rPr>
+          <w:rFonts w:ascii="Times New Roman" w:hAnsi="Times New Roman" w:cs="Times New Roman" w:eastAsia="Times New Roman"/>
+          <w:sz w:val="18"/>
+        </w:rPr>
+        <w:t xml:space="preserve">†Data used in preparation of this article were obtained from the Alzheimer’s Disease Neuroimaging Initiative (ADNI) database (adni.loni.usc.edu). As such, the investigators within the ADNI contributed to the design and implementation of ADNI and/or provided data but did not participate in analysis or writing of this report. A complete listing of ADNI investigators can be found at: </w:t>
       </w:r>
       <w:hyperlink r:id="rId14" w:history="1">
         <w:r>

</xml_diff>

<commit_message>
References: APA 7 format per IRO instructions for authors
Co-Authored-By: Claude Sonnet 5.5 <noreply@anthropic.com>
</commit_message>
<xml_diff>
--- a/paper/TCSST_manuscript_corrected.docx
+++ b/paper/TCSST_manuscript_corrected.docx
@@ -9567,7 +9567,7 @@
           <w:color w:val="222222"/>
           <w:sz w:val="20"/>
         </w:rPr>
-        <w:t xml:space="preserve">Zheng, Z., Y. Su, K. Chen, D. Weidman, T. Wu, S. C. Lo, F. Lure, and J. Li, for the Alzheimer’s Disease Neuroimaging Initiative. “Uncertainty-Driven Modality Selection for Data-Efficient Prediction of Alzheimer’s Disease.” </w:t>
+        <w:t xml:space="preserve">Zheng, Z., Su, Y., Chen, K., Weidman, D., Wu, T., Lo, S. C., Lure, F., Li, J., &amp; Alzheimer’s Disease Neuroimaging Initiative. (2024). Uncertainty-driven modality selection for data-efficient prediction of Alzheimer’s disease. </w:t>
       </w:r>
       <w:r>
         <w:rPr>
@@ -9576,7 +9576,7 @@
           <w:color w:val="222222"/>
           <w:sz w:val="20"/>
         </w:rPr>
-        <w:t>IISE Transactions on Healthcare Systems Engineering</w:t>
+        <w:t>IISE Transactions on Healthcare Systems Engineering, 14</w:t>
       </w:r>
       <w:r>
         <w:rPr>
@@ -9584,7 +9584,7 @@
           <w:color w:val="222222"/>
           <w:sz w:val="20"/>
         </w:rPr>
-        <w:t xml:space="preserve"> 14, no. 1 (2024): 18–31. </w:t>
+        <w:t xml:space="preserve">(1), 18–31. </w:t>
       </w:r>
       <w:hyperlink r:id="rId27" w:history="1">
         <w:r>
@@ -9597,14 +9597,6 @@
           <w:t xml:space="preserve">https://doi.org/10.1080/24725579.2023.2227197</w:t>
         </w:r>
       </w:hyperlink>
-      <w:r>
-        <w:rPr>
-          <w:rFonts w:ascii="Times New Roman" w:hAnsi="Times New Roman" w:cs="Times New Roman" w:eastAsia="Times New Roman"/>
-          <w:color w:val="222222"/>
-          <w:sz w:val="20"/>
-        </w:rPr>
-        <w:t>.</w:t>
-      </w:r>
     </w:p>
     <w:p>
       <w:pPr>
@@ -9631,8 +9623,36 @@
           <w:color w:val="222222"/>
           <w:sz w:val="20"/>
         </w:rPr>
-        <w:t>Doan, L., B. Chen, E. Litton, H. Huang, J. Huang, Y. Xie, W. Zhou, N. Narayanan, and C. Zhao. “ProMUSE: Progressive Multi-Modal Uncertainty-Guided Staged Evidential Alzheimer Disease Classification.” Preprint, arXiv:2606.19371, 2026.</w:t>
+        <w:t xml:space="preserve">Doan, L., Chen, B., Litton, E., Huang, H., Huang, J., Xie, Y., Zhou, W., Narayanan, N., &amp; Zhao, C. (2026). </w:t>
       </w:r>
+      <w:r>
+        <w:rPr>
+          <w:rFonts w:ascii="Times New Roman" w:hAnsi="Times New Roman" w:cs="Times New Roman" w:eastAsia="Times New Roman"/>
+          <w:i/>
+          <w:color w:val="222222"/>
+          <w:sz w:val="20"/>
+        </w:rPr>
+        <w:t>ProMUSE: Progressive multi-modal uncertainty-guided staged evidential Alzheimer disease classification</w:t>
+      </w:r>
+      <w:r>
+        <w:rPr>
+          <w:rFonts w:ascii="Times New Roman" w:hAnsi="Times New Roman" w:cs="Times New Roman" w:eastAsia="Times New Roman"/>
+          <w:color w:val="222222"/>
+          <w:sz w:val="20"/>
+        </w:rPr>
+        <w:t xml:space="preserve"> [Preprint]. arXiv. </w:t>
+      </w:r>
+      <w:hyperlink r:id="rId28" w:history="1">
+        <w:r>
+          <w:rPr>
+            <w:rStyle w:val="Hyperlink"/>
+            <w:rFonts w:ascii="Times New Roman" w:hAnsi="Times New Roman" w:cs="Times New Roman"/>
+            <w:sz w:val="20"/>
+            <w:szCs w:val="20"/>
+          </w:rPr>
+          <w:t xml:space="preserve">https://arxiv.org/abs/2606.19371</w:t>
+        </w:r>
+      </w:hyperlink>
     </w:p>
     <w:p>
       <w:pPr>
@@ -9659,7 +9679,7 @@
           <w:color w:val="222222"/>
           <w:sz w:val="20"/>
         </w:rPr>
-        <w:t xml:space="preserve">Drissi, N., N. Khalil, H. El-Kassabi, M. A. Serhani, and R. Dssouli. “Efficient Alzheimer’s Diagnosis through Sequential Decision-Making with Reinforcement Learning.” In </w:t>
+        <w:t xml:space="preserve">Drissi, N., Khalil, N., El-Kassabi, H., Serhani, M. A., &amp; Dssouli, R. (2025). Efficient Alzheimer’s diagnosis through sequential decision-making with reinforcement learning. In </w:t>
       </w:r>
       <w:r>
         <w:rPr>
@@ -9676,9 +9696,9 @@
           <w:color w:val="222222"/>
           <w:sz w:val="20"/>
         </w:rPr>
-        <w:t xml:space="preserve">, 108–16. ACM, 2025. </w:t>
+        <w:t xml:space="preserve"> (pp. 108–116). ACM. </w:t>
       </w:r>
-      <w:hyperlink r:id="rId28" w:history="1">
+      <w:hyperlink r:id="rId29" w:history="1">
         <w:r>
           <w:rPr>
             <w:rStyle w:val="Hyperlink"/>
@@ -9689,14 +9709,6 @@
           <w:t xml:space="preserve">https://doi.org/10.1145/3778265.3778280</w:t>
         </w:r>
       </w:hyperlink>
-      <w:r>
-        <w:rPr>
-          <w:rFonts w:ascii="Times New Roman" w:hAnsi="Times New Roman" w:cs="Times New Roman" w:eastAsia="Times New Roman"/>
-          <w:color w:val="222222"/>
-          <w:sz w:val="20"/>
-        </w:rPr>
-        <w:t>.</w:t>
-      </w:r>
     </w:p>
     <w:p>
       <w:pPr>
@@ -9723,7 +9735,7 @@
           <w:color w:val="222222"/>
           <w:sz w:val="20"/>
         </w:rPr>
-        <w:t xml:space="preserve">Aronsson, L., A. Rahbar, and M. H. Chehreghani. “A Survey on Active Feature Acquisition Strategies.” In </w:t>
+        <w:t xml:space="preserve">Aronsson, L., Rahbar, A., &amp; Chehreghani, M. H. (2026). A survey on active feature acquisition strategies. In </w:t>
       </w:r>
       <w:r>
         <w:rPr>
@@ -9740,9 +9752,9 @@
           <w:color w:val="222222"/>
           <w:sz w:val="20"/>
         </w:rPr>
-        <w:t xml:space="preserve">, 7740–48. IJCAI, 2026. </w:t>
+        <w:t xml:space="preserve"> (pp. 7740–7748). IJCAI. </w:t>
       </w:r>
-      <w:hyperlink r:id="rId29" w:history="1">
+      <w:hyperlink r:id="rId30" w:history="1">
         <w:r>
           <w:rPr>
             <w:rStyle w:val="Hyperlink"/>
@@ -9753,14 +9765,6 @@
           <w:t xml:space="preserve">https://doi.org/10.24963/ijcai.2026/860</w:t>
         </w:r>
       </w:hyperlink>
-      <w:r>
-        <w:rPr>
-          <w:rFonts w:ascii="Times New Roman" w:hAnsi="Times New Roman" w:cs="Times New Roman" w:eastAsia="Times New Roman"/>
-          <w:color w:val="222222"/>
-          <w:sz w:val="20"/>
-        </w:rPr>
-        <w:t>.</w:t>
-      </w:r>
     </w:p>
     <w:p>
       <w:pPr>
@@ -9787,7 +9791,7 @@
           <w:color w:val="222222"/>
           <w:sz w:val="20"/>
         </w:rPr>
-        <w:t xml:space="preserve">Schütz, V., H. Wu, R. Rezvan, L. Aronsson, and M. H. Chehreghani. “AFABench: A Generic Framework for Benchmarking Active Feature Acquisition.” In </w:t>
+        <w:t xml:space="preserve">Schütz, V., Wu, H., Rezvan, R., Aronsson, L., &amp; Chehreghani, M. H. (2026). AFABench: A generic framework for benchmarking active feature acquisition. In </w:t>
       </w:r>
       <w:r>
         <w:rPr>
@@ -9804,9 +9808,9 @@
           <w:color w:val="222222"/>
           <w:sz w:val="20"/>
         </w:rPr>
-        <w:t xml:space="preserve">, 9765–76. ACM, 2026. </w:t>
+        <w:t xml:space="preserve"> (pp. 9765–9776). ACM. </w:t>
       </w:r>
-      <w:hyperlink r:id="rId30" w:history="1">
+      <w:hyperlink r:id="rId31" w:history="1">
         <w:r>
           <w:rPr>
             <w:rStyle w:val="Hyperlink"/>
@@ -9817,14 +9821,6 @@
           <w:t xml:space="preserve">https://doi.org/10.1145/3770855.3817493</w:t>
         </w:r>
       </w:hyperlink>
-      <w:r>
-        <w:rPr>
-          <w:rFonts w:ascii="Times New Roman" w:hAnsi="Times New Roman" w:cs="Times New Roman" w:eastAsia="Times New Roman"/>
-          <w:color w:val="222222"/>
-          <w:sz w:val="20"/>
-        </w:rPr>
-        <w:t>.</w:t>
-      </w:r>
     </w:p>
     <w:p>
       <w:pPr>
@@ -9851,8 +9847,36 @@
           <w:color w:val="222222"/>
           <w:sz w:val="20"/>
         </w:rPr>
-        <w:t>von Kleist, H., A. Zamanian, I. Shpitser, and N. Ahmidi. “Evaluation of Active Feature Acquisition Methods for Static Feature Settings.” Preprint, arXiv:2312.03619, 2023.</w:t>
+        <w:t xml:space="preserve">von Kleist, H., Zamanian, A., Shpitser, I., &amp; Ahmidi, N. (2023). </w:t>
       </w:r>
+      <w:r>
+        <w:rPr>
+          <w:rFonts w:ascii="Times New Roman" w:hAnsi="Times New Roman" w:cs="Times New Roman" w:eastAsia="Times New Roman"/>
+          <w:i/>
+          <w:color w:val="222222"/>
+          <w:sz w:val="20"/>
+        </w:rPr>
+        <w:t>Evaluation of active feature acquisition methods for static feature settings</w:t>
+      </w:r>
+      <w:r>
+        <w:rPr>
+          <w:rFonts w:ascii="Times New Roman" w:hAnsi="Times New Roman" w:cs="Times New Roman" w:eastAsia="Times New Roman"/>
+          <w:color w:val="222222"/>
+          <w:sz w:val="20"/>
+        </w:rPr>
+        <w:t xml:space="preserve"> [Preprint]. arXiv. </w:t>
+      </w:r>
+      <w:hyperlink r:id="rId32" w:history="1">
+        <w:r>
+          <w:rPr>
+            <w:rStyle w:val="Hyperlink"/>
+            <w:rFonts w:ascii="Times New Roman" w:hAnsi="Times New Roman" w:cs="Times New Roman"/>
+            <w:sz w:val="20"/>
+            <w:szCs w:val="20"/>
+          </w:rPr>
+          <w:t xml:space="preserve">https://arxiv.org/abs/2312.03619</w:t>
+        </w:r>
+      </w:hyperlink>
     </w:p>
     <w:p>
       <w:pPr>
@@ -9879,8 +9903,36 @@
           <w:color w:val="222222"/>
           <w:sz w:val="20"/>
         </w:rPr>
-        <w:t>Rajabinasab, M., M. E. Houle, O. Chelly, and A. Zimek. “Worse than Random: The Importance of a Baseline for Unsupervised Feature Selection.” Preprint, arXiv:2605.22973, 2026.</w:t>
+        <w:t xml:space="preserve">Rajabinasab, M., Houle, M. E., Chelly, O., &amp; Zimek, A. (2026). </w:t>
       </w:r>
+      <w:r>
+        <w:rPr>
+          <w:rFonts w:ascii="Times New Roman" w:hAnsi="Times New Roman" w:cs="Times New Roman" w:eastAsia="Times New Roman"/>
+          <w:i/>
+          <w:color w:val="222222"/>
+          <w:sz w:val="20"/>
+        </w:rPr>
+        <w:t>Worse than random: The importance of a baseline for unsupervised feature selection</w:t>
+      </w:r>
+      <w:r>
+        <w:rPr>
+          <w:rFonts w:ascii="Times New Roman" w:hAnsi="Times New Roman" w:cs="Times New Roman" w:eastAsia="Times New Roman"/>
+          <w:color w:val="222222"/>
+          <w:sz w:val="20"/>
+        </w:rPr>
+        <w:t xml:space="preserve"> [Preprint]. arXiv. </w:t>
+      </w:r>
+      <w:hyperlink r:id="rId33" w:history="1">
+        <w:r>
+          <w:rPr>
+            <w:rStyle w:val="Hyperlink"/>
+            <w:rFonts w:ascii="Times New Roman" w:hAnsi="Times New Roman" w:cs="Times New Roman"/>
+            <w:sz w:val="20"/>
+            <w:szCs w:val="20"/>
+          </w:rPr>
+          <w:t xml:space="preserve">https://arxiv.org/abs/2605.22973</w:t>
+        </w:r>
+      </w:hyperlink>
     </w:p>
     <w:p>
       <w:pPr>
@@ -9907,8 +9959,36 @@
           <w:color w:val="222222"/>
           <w:sz w:val="20"/>
         </w:rPr>
-        <w:t>Perets, B., N. Mendelson, S. Vainberg, Y. Chowers, S. Shen-Orr, and S. Mannor. “Zero-Shot Active Feature Acquisition via LLM-Elicitation.” Preprint, arXiv:2606.18933, 2026.</w:t>
+        <w:t xml:space="preserve">Perets, B., Mendelson, N., Vainberg, S., Chowers, Y., Shen-Orr, S., &amp; Mannor, S. (2026). </w:t>
       </w:r>
+      <w:r>
+        <w:rPr>
+          <w:rFonts w:ascii="Times New Roman" w:hAnsi="Times New Roman" w:cs="Times New Roman" w:eastAsia="Times New Roman"/>
+          <w:i/>
+          <w:color w:val="222222"/>
+          <w:sz w:val="20"/>
+        </w:rPr>
+        <w:t>Zero-shot active feature acquisition via LLM-elicitation</w:t>
+      </w:r>
+      <w:r>
+        <w:rPr>
+          <w:rFonts w:ascii="Times New Roman" w:hAnsi="Times New Roman" w:cs="Times New Roman" w:eastAsia="Times New Roman"/>
+          <w:color w:val="222222"/>
+          <w:sz w:val="20"/>
+        </w:rPr>
+        <w:t xml:space="preserve"> [Preprint]. arXiv. </w:t>
+      </w:r>
+      <w:hyperlink r:id="rId34" w:history="1">
+        <w:r>
+          <w:rPr>
+            <w:rStyle w:val="Hyperlink"/>
+            <w:rFonts w:ascii="Times New Roman" w:hAnsi="Times New Roman" w:cs="Times New Roman"/>
+            <w:sz w:val="20"/>
+            <w:szCs w:val="20"/>
+          </w:rPr>
+          <w:t xml:space="preserve">https://arxiv.org/abs/2606.18933</w:t>
+        </w:r>
+      </w:hyperlink>
     </w:p>
     <w:p>
       <w:pPr>
@@ -9935,7 +10015,7 @@
           <w:color w:val="222222"/>
           <w:sz w:val="20"/>
         </w:rPr>
-        <w:t xml:space="preserve">Marinescu, R. V., N. P. Oxtoby, A. L. Young, E. E. Bron, A. W. Toga, M. W. Weiner, F. Barkhof, et al. “TADPOLE Challenge: Accurate Alzheimer’s Disease Prediction through Crowdsourced Forecasting of Future Data.” In </w:t>
+        <w:t xml:space="preserve">Marinescu, R. V., Oxtoby, N. P., Young, A. L., Bron, E. E., Toga, A. W., Weiner, M. W., Barkhof, F., et al. (2019). TADPOLE challenge: Accurate Alzheimer’s disease prediction through crowdsourced forecasting of future data. In </w:t>
       </w:r>
       <w:r>
         <w:rPr>
@@ -9952,9 +10032,9 @@
           <w:color w:val="222222"/>
           <w:sz w:val="20"/>
         </w:rPr>
-        <w:t xml:space="preserve">. Springer, 2019. </w:t>
+        <w:t xml:space="preserve">. Springer. </w:t>
       </w:r>
-      <w:hyperlink r:id="rId31" w:history="1">
+      <w:hyperlink r:id="rId35" w:history="1">
         <w:r>
           <w:rPr>
             <w:rStyle w:val="Hyperlink"/>
@@ -9965,22 +10045,6 @@
           <w:t xml:space="preserve">https://doi.org/10.1007/978-3-030-32281-6_1</w:t>
         </w:r>
       </w:hyperlink>
-      <w:r>
-        <w:rPr>
-          <w:rFonts w:ascii="Times New Roman" w:hAnsi="Times New Roman" w:cs="Times New Roman" w:eastAsia="Times New Roman"/>
-          <w:color w:val="222222"/>
-          <w:sz w:val="20"/>
-        </w:rPr>
-        <w:t>.</w:t>
-      </w:r>
-      <w:r>
-        <w:rPr>
-          <w:rFonts w:ascii="Times New Roman" w:hAnsi="Times New Roman" w:cs="Times New Roman" w:eastAsia="Times New Roman"/>
-          <w:color w:val="222222"/>
-          <w:sz w:val="20"/>
-        </w:rPr>
-        <w:t xml:space="preserve"> Preprint, arXiv:2001.09016.</w:t>
-      </w:r>
     </w:p>
     <w:p>
       <w:pPr>
@@ -10007,7 +10071,7 @@
           <w:color w:val="222222"/>
           <w:sz w:val="20"/>
         </w:rPr>
-        <w:t xml:space="preserve">Dickerson, B. C., and D. A. Wolk, for the Alzheimer’s Disease Neuroimaging Initiative. “Biomarker-Based Prediction of Progression in MCI: Comparison of AD Signature and Hippocampal Volume with Spinal Fluid Amyloid-Beta and Tau.” </w:t>
+        <w:t xml:space="preserve">Dickerson, B. C., Wolk, D. A., &amp; Alzheimer’s Disease Neuroimaging Initiative. (2013). Biomarker-based prediction of progression in MCI: Comparison of AD signature and hippocampal volume with spinal fluid amyloid-beta and tau. </w:t>
       </w:r>
       <w:r>
         <w:rPr>
@@ -10016,7 +10080,7 @@
           <w:color w:val="222222"/>
           <w:sz w:val="20"/>
         </w:rPr>
-        <w:t>Frontiers in Aging Neuroscience</w:t>
+        <w:t>Frontiers in Aging Neuroscience, 5</w:t>
       </w:r>
       <w:r>
         <w:rPr>
@@ -10024,9 +10088,9 @@
           <w:color w:val="222222"/>
           <w:sz w:val="20"/>
         </w:rPr>
-        <w:t xml:space="preserve"> 5 (2013): 55. </w:t>
+        <w:t xml:space="preserve">, Article 55. </w:t>
       </w:r>
-      <w:hyperlink r:id="rId32" w:history="1">
+      <w:hyperlink r:id="rId36" w:history="1">
         <w:r>
           <w:rPr>
             <w:rStyle w:val="Hyperlink"/>
@@ -10037,14 +10101,6 @@
           <w:t xml:space="preserve">https://doi.org/10.3389/fnagi.2013.00055</w:t>
         </w:r>
       </w:hyperlink>
-      <w:r>
-        <w:rPr>
-          <w:rFonts w:ascii="Times New Roman" w:hAnsi="Times New Roman" w:cs="Times New Roman" w:eastAsia="Times New Roman"/>
-          <w:color w:val="222222"/>
-          <w:sz w:val="20"/>
-        </w:rPr>
-        <w:t>.</w:t>
-      </w:r>
     </w:p>
     <w:p>
       <w:pPr>
@@ -10071,7 +10127,7 @@
           <w:color w:val="222222"/>
           <w:sz w:val="20"/>
         </w:rPr>
-        <w:t xml:space="preserve">Thung, K.-H., P.-T. Yap, and D. Shen. “Multi-Stage Diagnosis of Alzheimer’s Disease with Incomplete Multimodal Data via Multi-Task Deep Learning.” In </w:t>
+        <w:t xml:space="preserve">Thung, K.-H., Yap, P.-T., &amp; Shen, D. (2017). Multi-stage diagnosis of Alzheimer’s disease with incomplete multimodal data via multi-task deep learning. In </w:t>
       </w:r>
       <w:r>
         <w:rPr>
@@ -10080,7 +10136,7 @@
           <w:color w:val="222222"/>
           <w:sz w:val="20"/>
         </w:rPr>
-        <w:t>Deep Learning in Medical Image Analysis and Multimodal Learning for Clinical Decision Support</w:t>
+        <w:t>Deep learning in medical image analysis and multimodal learning for clinical decision support</w:t>
       </w:r>
       <w:r>
         <w:rPr>
@@ -10088,9 +10144,9 @@
           <w:color w:val="222222"/>
           <w:sz w:val="20"/>
         </w:rPr>
-        <w:t xml:space="preserve">, 160–68. Springer, 2017. </w:t>
+        <w:t xml:space="preserve"> (pp. 160–168). Springer. </w:t>
       </w:r>
-      <w:hyperlink r:id="rId33" w:history="1">
+      <w:hyperlink r:id="rId37" w:history="1">
         <w:r>
           <w:rPr>
             <w:rStyle w:val="Hyperlink"/>
@@ -10101,14 +10157,6 @@
           <w:t xml:space="preserve">https://doi.org/10.1007/978-3-319-67558-9_19</w:t>
         </w:r>
       </w:hyperlink>
-      <w:r>
-        <w:rPr>
-          <w:rFonts w:ascii="Times New Roman" w:hAnsi="Times New Roman" w:cs="Times New Roman" w:eastAsia="Times New Roman"/>
-          <w:color w:val="222222"/>
-          <w:sz w:val="20"/>
-        </w:rPr>
-        <w:t>.</w:t>
-      </w:r>
     </w:p>
     <w:p>
       <w:pPr>
@@ -10135,7 +10183,7 @@
           <w:color w:val="222222"/>
           <w:sz w:val="20"/>
         </w:rPr>
-        <w:t xml:space="preserve">Young, V. M., S. Gates, L. Y. Garcia, and A. Salardini. “Data Leakage in Deep Learning for Alzheimer’s Disease Diagnosis: A Scoping Review of Methodological Rigor and Performance Inflation.” </w:t>
+        <w:t xml:space="preserve">Young, V. M., Gates, S., Garcia, L. Y., &amp; Salardini, A. (2025). Data leakage in deep learning for Alzheimer’s disease diagnosis: A scoping review of methodological rigor and performance inflation. </w:t>
       </w:r>
       <w:r>
         <w:rPr>
@@ -10144,7 +10192,7 @@
           <w:color w:val="222222"/>
           <w:sz w:val="20"/>
         </w:rPr>
-        <w:t>Diagnostics</w:t>
+        <w:t>Diagnostics, 15</w:t>
       </w:r>
       <w:r>
         <w:rPr>
@@ -10152,9 +10200,9 @@
           <w:color w:val="222222"/>
           <w:sz w:val="20"/>
         </w:rPr>
-        <w:t xml:space="preserve"> 15, no. 18 (2025): 2348. </w:t>
+        <w:t xml:space="preserve">(18), Article 2348. </w:t>
       </w:r>
-      <w:hyperlink r:id="rId34" w:history="1">
+      <w:hyperlink r:id="rId38" w:history="1">
         <w:r>
           <w:rPr>
             <w:rStyle w:val="Hyperlink"/>
@@ -10165,14 +10213,6 @@
           <w:t xml:space="preserve">https://doi.org/10.3390/diagnostics15182348</w:t>
         </w:r>
       </w:hyperlink>
-      <w:r>
-        <w:rPr>
-          <w:rFonts w:ascii="Times New Roman" w:hAnsi="Times New Roman" w:cs="Times New Roman" w:eastAsia="Times New Roman"/>
-          <w:color w:val="222222"/>
-          <w:sz w:val="20"/>
-        </w:rPr>
-        <w:t>.</w:t>
-      </w:r>
     </w:p>
     <w:p>
       <w:pPr>
@@ -10199,7 +10239,7 @@
           <w:color w:val="222222"/>
           <w:sz w:val="20"/>
         </w:rPr>
-        <w:t xml:space="preserve">Wen, J., E. Thibeau-Sutre, M. Diaz-Melo, J. Samper-Gonzalez, A. Routier, S. Bottani, D. Dormont, S. Durrleman, N. Burgos, and O. Colliot. “Convolutional Neural Networks for Classification of Alzheimer’s Disease: Overview and Reproducible Evaluation.” </w:t>
+        <w:t xml:space="preserve">Wen, J., Thibeau-Sutre, E., Diaz-Melo, M., Samper-Gonzalez, J., Routier, A., Bottani, S., Dormont, D., Durrleman, S., Burgos, N., &amp; Colliot, O. (2020). Convolutional neural networks for classification of Alzheimer’s disease: Overview and reproducible evaluation. </w:t>
       </w:r>
       <w:r>
         <w:rPr>
@@ -10208,7 +10248,7 @@
           <w:color w:val="222222"/>
           <w:sz w:val="20"/>
         </w:rPr>
-        <w:t>Medical Image Analysis</w:t>
+        <w:t>Medical Image Analysis, 63</w:t>
       </w:r>
       <w:r>
         <w:rPr>
@@ -10216,9 +10256,9 @@
           <w:color w:val="222222"/>
           <w:sz w:val="20"/>
         </w:rPr>
-        <w:t xml:space="preserve"> 63 (2020): 101694. </w:t>
+        <w:t xml:space="preserve">, Article 101694. </w:t>
       </w:r>
-      <w:hyperlink r:id="rId35" w:history="1">
+      <w:hyperlink r:id="rId39" w:history="1">
         <w:r>
           <w:rPr>
             <w:rStyle w:val="Hyperlink"/>
@@ -10229,14 +10269,6 @@
           <w:t xml:space="preserve">https://doi.org/10.1016/j.media.2020.101694</w:t>
         </w:r>
       </w:hyperlink>
-      <w:r>
-        <w:rPr>
-          <w:rFonts w:ascii="Times New Roman" w:hAnsi="Times New Roman" w:cs="Times New Roman" w:eastAsia="Times New Roman"/>
-          <w:color w:val="222222"/>
-          <w:sz w:val="20"/>
-        </w:rPr>
-        <w:t>.</w:t>
-      </w:r>
     </w:p>
     <w:p>
       <w:pPr>
@@ -10263,7 +10295,7 @@
           <w:color w:val="222222"/>
           <w:sz w:val="20"/>
         </w:rPr>
-        <w:t xml:space="preserve">Yuan, C., K. A. Linn, and R. A. Hubbard. “Algorithmic Fairness of Machine Learning Models for Alzheimer Disease Progression.” </w:t>
+        <w:t xml:space="preserve">Yuan, C., Linn, K. A., &amp; Hubbard, R. A. (2023). Algorithmic fairness of machine learning models for Alzheimer disease progression. </w:t>
       </w:r>
       <w:r>
         <w:rPr>
@@ -10272,7 +10304,7 @@
           <w:color w:val="222222"/>
           <w:sz w:val="20"/>
         </w:rPr>
-        <w:t>JAMA Network Open</w:t>
+        <w:t>JAMA Network Open, 6</w:t>
       </w:r>
       <w:r>
         <w:rPr>
@@ -10280,9 +10312,9 @@
           <w:color w:val="222222"/>
           <w:sz w:val="20"/>
         </w:rPr>
-        <w:t xml:space="preserve"> 6, no. 11 (2023): e2342203. </w:t>
+        <w:t xml:space="preserve">(11), Article e2342203. </w:t>
       </w:r>
-      <w:hyperlink r:id="rId36" w:history="1">
+      <w:hyperlink r:id="rId40" w:history="1">
         <w:r>
           <w:rPr>
             <w:rStyle w:val="Hyperlink"/>
@@ -10293,14 +10325,6 @@
           <w:t xml:space="preserve">https://doi.org/10.1001/jamanetworkopen.2023.42203</w:t>
         </w:r>
       </w:hyperlink>
-      <w:r>
-        <w:rPr>
-          <w:rFonts w:ascii="Times New Roman" w:hAnsi="Times New Roman" w:cs="Times New Roman" w:eastAsia="Times New Roman"/>
-          <w:color w:val="222222"/>
-          <w:sz w:val="20"/>
-        </w:rPr>
-        <w:t>.</w:t>
-      </w:r>
     </w:p>
     <w:p>
       <w:pPr>
@@ -10327,7 +10351,7 @@
           <w:color w:val="222222"/>
           <w:sz w:val="20"/>
         </w:rPr>
-        <w:t xml:space="preserve">Sensoy, M., L. Kaplan, and M. Kandemir. “Evidential Deep Learning to Quantify Classification Uncertainty.” In </w:t>
+        <w:t xml:space="preserve">Sensoy, M., Kaplan, L., &amp; Kandemir, M. (2018). Evidential deep learning to quantify classification uncertainty. In </w:t>
       </w:r>
       <w:r>
         <w:rPr>
@@ -10344,7 +10368,7 @@
           <w:color w:val="222222"/>
           <w:sz w:val="20"/>
         </w:rPr>
-        <w:t>, vol. 31. 2018.</w:t>
+        <w:t xml:space="preserve"> (Vol. 31).</w:t>
       </w:r>
     </w:p>
     <w:p>
@@ -10372,7 +10396,7 @@
           <w:color w:val="222222"/>
           <w:sz w:val="20"/>
         </w:rPr>
-        <w:t xml:space="preserve">Benjamini, Y., and Y. Hochberg. “Controlling the False Discovery Rate: A Practical and Powerful Approach to Multiple Testing.” </w:t>
+        <w:t xml:space="preserve">Benjamini, Y., &amp; Hochberg, Y. (1995). Controlling the false discovery rate: A practical and powerful approach to multiple testing. </w:t>
       </w:r>
       <w:r>
         <w:rPr>
@@ -10381,7 +10405,7 @@
           <w:color w:val="222222"/>
           <w:sz w:val="20"/>
         </w:rPr>
-        <w:t>Journal of the Royal Statistical Society: Series B</w:t>
+        <w:t>Journal of the Royal Statistical Society: Series B (Methodological), 57</w:t>
       </w:r>
       <w:r>
         <w:rPr>
@@ -10389,9 +10413,9 @@
           <w:color w:val="222222"/>
           <w:sz w:val="20"/>
         </w:rPr>
-        <w:t xml:space="preserve"> 57, no. 1 (1995): 289–300. </w:t>
+        <w:t xml:space="preserve">(1), 289–300. </w:t>
       </w:r>
-      <w:hyperlink r:id="rId37" w:history="1">
+      <w:hyperlink r:id="rId41" w:history="1">
         <w:r>
           <w:rPr>
             <w:rStyle w:val="Hyperlink"/>
@@ -10402,14 +10426,6 @@
           <w:t xml:space="preserve">https://doi.org/10.1111/j.2517-6161.1995.tb02031.x</w:t>
         </w:r>
       </w:hyperlink>
-      <w:r>
-        <w:rPr>
-          <w:rFonts w:ascii="Times New Roman" w:hAnsi="Times New Roman" w:cs="Times New Roman" w:eastAsia="Times New Roman"/>
-          <w:color w:val="222222"/>
-          <w:sz w:val="20"/>
-        </w:rPr>
-        <w:t>.</w:t>
-      </w:r>
     </w:p>
     <w:p>
       <w:pPr>
@@ -10436,7 +10452,7 @@
           <w:color w:val="222222"/>
           <w:sz w:val="20"/>
         </w:rPr>
-        <w:t xml:space="preserve">Vickers, A. J., and E. B. Elkin. “Decision Curve Analysis: A Novel Method for Evaluating Prediction Models.” </w:t>
+        <w:t xml:space="preserve">Vickers, A. J., &amp; Elkin, E. B. (2006). Decision curve analysis: A novel method for evaluating prediction models. </w:t>
       </w:r>
       <w:r>
         <w:rPr>
@@ -10445,7 +10461,7 @@
           <w:color w:val="222222"/>
           <w:sz w:val="20"/>
         </w:rPr>
-        <w:t>Medical Decision Making</w:t>
+        <w:t>Medical Decision Making, 26</w:t>
       </w:r>
       <w:r>
         <w:rPr>
@@ -10453,9 +10469,9 @@
           <w:color w:val="222222"/>
           <w:sz w:val="20"/>
         </w:rPr>
-        <w:t xml:space="preserve"> 26, no. 6 (2006): 565–74. </w:t>
+        <w:t xml:space="preserve">(6), 565–574. </w:t>
       </w:r>
-      <w:hyperlink r:id="rId38" w:history="1">
+      <w:hyperlink r:id="rId42" w:history="1">
         <w:r>
           <w:rPr>
             <w:rStyle w:val="Hyperlink"/>
@@ -10466,14 +10482,6 @@
           <w:t xml:space="preserve">https://doi.org/10.1177/0272989X06295361</w:t>
         </w:r>
       </w:hyperlink>
-      <w:r>
-        <w:rPr>
-          <w:rFonts w:ascii="Times New Roman" w:hAnsi="Times New Roman" w:cs="Times New Roman" w:eastAsia="Times New Roman"/>
-          <w:color w:val="222222"/>
-          <w:sz w:val="20"/>
-        </w:rPr>
-        <w:t>.</w:t>
-      </w:r>
     </w:p>
     <w:p>
       <w:pPr>
@@ -10528,7 +10536,7 @@
                           <pic:cNvPicPr/>
                         </pic:nvPicPr>
                         <pic:blipFill>
-                          <a:blip r:embed="rId39"/>
+                          <a:blip r:embed="rId43"/>
                           <a:stretch>
                             <a:fillRect/>
                           </a:stretch>
@@ -10621,7 +10629,7 @@
                           <pic:cNvPicPr/>
                         </pic:nvPicPr>
                         <pic:blipFill>
-                          <a:blip r:embed="rId40"/>
+                          <a:blip r:embed="rId44"/>
                           <a:stretch>
                             <a:fillRect/>
                           </a:stretch>
@@ -10714,7 +10722,7 @@
                           <pic:cNvPicPr/>
                         </pic:nvPicPr>
                         <pic:blipFill>
-                          <a:blip r:embed="rId41"/>
+                          <a:blip r:embed="rId45"/>
                           <a:stretch>
                             <a:fillRect/>
                           </a:stretch>
@@ -10822,7 +10830,7 @@
                           <pic:cNvPicPr/>
                         </pic:nvPicPr>
                         <pic:blipFill>
-                          <a:blip r:embed="rId42"/>
+                          <a:blip r:embed="rId46"/>
                           <a:stretch>
                             <a:fillRect/>
                           </a:stretch>

</xml_diff>

<commit_message>
Cut manuscript to 19 pages: move five secondary figures to a supplement, tighten text
Co-Authored-By: Claude Sonnet 5.5 <noreply@anthropic.com>
</commit_message>
<xml_diff>
--- a/paper/TCSST_manuscript_corrected.docx
+++ b/paper/TCSST_manuscript_corrected.docx
@@ -716,7 +716,7 @@
           <w:rFonts w:ascii="Times New Roman" w:hAnsi="Times New Roman" w:cs="Times New Roman" w:eastAsia="Times New Roman"/>
           <w:sz w:val="24"/>
         </w:rPr>
-        <w:t xml:space="preserve"> Reported accuracies in this field are known to be inflated by data leakage. A scoping review of 44 AD deep-learning studies found that 68.2% relied on ADNI and only 15.9% performed any external validation [12], and splitting by slice rather than by subject can move reported accuracy by as much as 28 percentage points [12, 13]. Our protocol is designed against these failure modes. Fairness in AD prediction models has been examined for prediction accuracy [14], but not, to our knowledge, for acquisition decisions.</w:t>
+        <w:t xml:space="preserve"> Reported accuracies in this field are known to be inflated by data leakage: a scoping review of 44 AD deep-learning studies found that 68.2% relied on ADNI and only 15.9% performed any external validation [12], and splitting by slice rather than by subject can move accuracy by as much as 28 percentage points [12, 13]. Our protocol is designed against these failure modes. Fairness in AD prediction models has been examined for prediction accuracy [14], but not, to our knowledge, for acquisition decisions.</w:t>
       </w:r>
     </w:p>
     <w:p>
@@ -2032,7 +2032,7 @@
           <w:rFonts w:ascii="Times New Roman" w:hAnsi="Times New Roman" w:cs="Times New Roman" w:eastAsia="Times New Roman"/>
           <w:sz w:val="24"/>
         </w:rPr>
-        <w:t xml:space="preserve"> at 12, 24 and 36 months). Table 2 reports realised costs at 24 months and Table 3 the three-horizon mean. Each policy is compared with random acquisition at the same expected cost (Section 3.6). No public code exists for any of the three published policies, so each was re-implemented from its description, giving the nine configurations listed in Table 2; results should therefore be read as our implementation of each mechanism rather than a reproduction of the original numbers. Table 3 and Figure 3 show one representative configuration of each policy: the uncertainty cascade at a target escalation of 53.8%, the staged evidential method’s full ladder with the shared predictor, and the RL policy at cost weight 0.01. The calibration, decision-curve and fairness analyses (Figures 7 and 11) use the RL policy at cost weight 0.05.</w:t>
+        <w:t xml:space="preserve"> at 12, 24 and 36 months). Table 2 reports realised costs at 24 months and Table 3 the three-horizon mean. Each policy is compared with random acquisition at the same expected cost (Section 3.6). No public code exists for any of the three published policies, so each was re-implemented from its description, giving the nine configurations listed in Table 2; results should therefore be read as our implementation of each mechanism rather than a reproduction of the original numbers. Table 3 and Figure 3 show one representative configuration of each policy: the uncertainty cascade at a target escalation of 53.8%, the staged evidential method’s full ladder with the shared predictor, and the RL policy at cost weight 0.01. The calibration, decision-curve and fairness analyses (Supplementary Figures S1 and S2) use the RL policy at cost weight 0.05.</w:t>
       </w:r>
     </w:p>
     <w:p>
@@ -5288,7 +5288,7 @@
           <w:rFonts w:ascii="Times New Roman" w:hAnsi="Times New Roman" w:cs="Times New Roman" w:eastAsia="Times New Roman"/>
           <w:sz w:val="24"/>
         </w:rPr>
-        <w:t xml:space="preserve">: for a policy whose mean cost is </w:t>
+        <w:t xml:space="preserve">: for a policy whose mean cost under a given regime is </w:t>
       </w:r>
       <m:oMath>
         <m:r>
@@ -5300,7 +5300,7 @@
           <w:rFonts w:ascii="Times New Roman" w:hAnsi="Times New Roman" w:cs="Times New Roman" w:eastAsia="Times New Roman"/>
           <w:sz w:val="24"/>
         </w:rPr>
-        <w:t xml:space="preserve"> under a given cost regime, the reference is random acquisition at rate </w:t>
+        <w:t xml:space="preserve">, the reference is random acquisition at rate </w:t>
       </w:r>
       <m:oMath>
         <m:r>
@@ -5312,7 +5312,7 @@
           <w:rFonts w:ascii="Times New Roman" w:hAnsi="Times New Roman" w:cs="Times New Roman" w:eastAsia="Times New Roman"/>
           <w:sz w:val="24"/>
         </w:rPr>
-        <w:t xml:space="preserve"> divided by the cost of acquiring all four modalities, averaged over 50 seeds and scored on the same subjects and the same cross-validation folds. The paired difference carries a 95% percentile interval and a two-sided bootstrap </w:t>
+        <w:t xml:space="preserve"> divided by the cost of acquiring all four modalities (50 seeds, same subjects and folds). Differences carry a 95% percentile interval and a two-sided bootstrap </w:t>
       </w:r>
       <m:oMath>
         <m:r>
@@ -5324,21 +5324,18 @@
           <w:rFonts w:ascii="Times New Roman" w:hAnsi="Times New Roman" w:cs="Times New Roman" w:eastAsia="Times New Roman"/>
           <w:sz w:val="24"/>
         </w:rPr>
-        <w:t xml:space="preserve">-value from 10,000 subject resamples (the </w:t>
+        <w:t>-value from 10,000 subject resamples (</w:t>
       </w:r>
       <m:oMath>
         <m:r>
           <m:t>p</m:t>
         </m:r>
-      </m:oMath>
-      <w:r>
-        <w:rPr>
-          <w:rFonts w:ascii="Times New Roman" w:hAnsi="Times New Roman" w:cs="Times New Roman" w:eastAsia="Times New Roman"/>
-          <w:sz w:val="24"/>
-        </w:rPr>
-        <w:t xml:space="preserve">-value is </w:t>
-      </w:r>
-      <m:oMath>
+        <m:r>
+          <m:rPr>
+            <m:sty m:val="p"/>
+          </m:rPr>
+          <m:t>=</m:t>
+        </m:r>
         <m:r>
           <m:rPr>
             <m:sty m:val="p"/>
@@ -5399,33 +5396,6 @@
           <w:rFonts w:ascii="Times New Roman" w:hAnsi="Times New Roman" w:cs="Times New Roman" w:eastAsia="Times New Roman"/>
           <w:sz w:val="24"/>
         </w:rPr>
-        <w:t xml:space="preserve">, so it cannot fall below </w:t>
-      </w:r>
-      <m:oMath>
-        <m:sSup>
-          <m:e>
-            <m:r>
-              <m:t>10</m:t>
-            </m:r>
-          </m:e>
-          <m:sup>
-            <m:r>
-              <m:rPr>
-                <m:sty m:val="p"/>
-              </m:rPr>
-              <m:t>−</m:t>
-            </m:r>
-            <m:r>
-              <m:t>4</m:t>
-            </m:r>
-          </m:sup>
-        </m:sSup>
-      </m:oMath>
-      <w:r>
-        <w:rPr>
-          <w:rFonts w:ascii="Times New Roman" w:hAnsi="Times New Roman" w:cs="Times New Roman" w:eastAsia="Times New Roman"/>
-          <w:sz w:val="24"/>
-        </w:rPr>
         <w:t xml:space="preserve">). The </w:t>
       </w:r>
       <w:r>
@@ -5441,7 +5411,7 @@
           <w:rFonts w:ascii="Times New Roman" w:hAnsi="Times New Roman" w:cs="Times New Roman" w:eastAsia="Times New Roman"/>
           <w:sz w:val="24"/>
         </w:rPr>
-        <w:t xml:space="preserve"> is the 13 policies that differ from random acquisition at their own cost, within each horizon and cost regime: the nine published configurations, fixed MRI, fixed MRI+FDG and the two SPFA operating points. Cheap-only and acquire-all are excluded, since random acquisition at rate 0 and 1 is identical to them. Holm adjustment is applied within each family of 13. We report the unadjusted interval and the Holm-adjusted </w:t>
+        <w:t xml:space="preserve"> is the 13 policies that differ from random acquisition at their own cost within each horizon and regime (nine published configurations, fixed MRI, fixed MRI+FDG and two SPFA points; cheap-only and acquire-all are identical to random at rate 0 and 1 and are excluded), Holm-adjusted within each family. Unadjusted intervals and adjusted </w:t>
       </w:r>
       <m:oMath>
         <m:r>
@@ -5453,22 +5423,7 @@
           <w:rFonts w:ascii="Times New Roman" w:hAnsi="Times New Roman" w:cs="Times New Roman" w:eastAsia="Times New Roman"/>
           <w:sz w:val="24"/>
         </w:rPr>
-        <w:t xml:space="preserve">-value separately and call a difference </w:t>
-      </w:r>
-      <w:r>
-        <w:rPr>
-          <w:rFonts w:ascii="Times New Roman" w:hAnsi="Times New Roman" w:cs="Times New Roman" w:eastAsia="Times New Roman"/>
-          <w:i/>
-          <w:sz w:val="24"/>
-        </w:rPr>
-        <w:t>significant after adjustment</w:t>
-      </w:r>
-      <w:r>
-        <w:rPr>
-          <w:rFonts w:ascii="Times New Roman" w:hAnsi="Times New Roman" w:cs="Times New Roman" w:eastAsia="Times New Roman"/>
-          <w:sz w:val="24"/>
-        </w:rPr>
-        <w:t xml:space="preserve"> only when the adjusted </w:t>
+        <w:t xml:space="preserve">-values are reported separately, and “significant after adjustment” means adjusted </w:t>
       </w:r>
       <m:oMath>
         <m:r>
@@ -5489,7 +5444,7 @@
           <w:rFonts w:ascii="Times New Roman" w:hAnsi="Times New Roman" w:cs="Times New Roman" w:eastAsia="Times New Roman"/>
           <w:sz w:val="24"/>
         </w:rPr>
-        <w:t>; “significant” without qualification never refers to the unadjusted interval. Comparisons with acquire-all are paired bootstrap intervals without adjustment and are descriptive.</w:t>
+        <w:t>. Comparisons with acquire-all are unadjusted and descriptive.</w:t>
       </w:r>
     </w:p>
     <w:p>
@@ -5501,7 +5456,7 @@
       <w:r>
         <w:drawing>
           <wp:inline xmlns:a="http://schemas.openxmlformats.org/drawingml/2006/main" xmlns:pic="http://schemas.openxmlformats.org/drawingml/2006/picture">
-            <wp:extent cx="4536000" cy="3380661"/>
+            <wp:extent cx="4140000" cy="3085524"/>
             <wp:docPr id="2" name="Picture 2"/>
             <wp:cNvGraphicFramePr>
               <a:graphicFrameLocks noChangeAspect="1"/>
@@ -5522,7 +5477,7 @@
                   <pic:spPr>
                     <a:xfrm>
                       <a:off x="0" y="0"/>
-                      <a:ext cx="4536000" cy="3380661"/>
+                      <a:ext cx="4140000" cy="3085524"/>
                     </a:xfrm>
                     <a:prstGeom prst="rect"/>
                   </pic:spPr>
@@ -5565,7 +5520,7 @@
           <w:rFonts w:ascii="Times New Roman" w:hAnsi="Times New Roman" w:cs="Times New Roman" w:eastAsia="Times New Roman"/>
           <w:sz w:val="24"/>
         </w:rPr>
-        <w:t xml:space="preserve">The matching is by </w:t>
+        <w:t xml:space="preserve">The match is on </w:t>
       </w:r>
       <w:r>
         <w:rPr>
@@ -5580,31 +5535,7 @@
           <w:rFonts w:ascii="Times New Roman" w:hAnsi="Times New Roman" w:cs="Times New Roman" w:eastAsia="Times New Roman"/>
           <w:sz w:val="24"/>
         </w:rPr>
-        <w:t xml:space="preserve"> cost, not a strict fixed budget. Random acquisition draws a different cost for every patient, so a policy whose mean cost is </w:t>
-      </w:r>
-      <m:oMath>
-        <m:r>
-          <m:t>c</m:t>
-        </m:r>
-      </m:oMath>
-      <w:r>
-        <w:rPr>
-          <w:rFonts w:ascii="Times New Roman" w:hAnsi="Times New Roman" w:cs="Times New Roman" w:eastAsia="Times New Roman"/>
-          <w:sz w:val="24"/>
-        </w:rPr>
-        <w:t xml:space="preserve"> is compared with random acquisition whose mean cost over 50 seeds is within 0.03, 0.01 and 0.05 units of </w:t>
-      </w:r>
-      <m:oMath>
-        <m:r>
-          <m:t>c</m:t>
-        </m:r>
-      </m:oMath>
-      <w:r>
-        <w:rPr>
-          <w:rFonts w:ascii="Times New Roman" w:hAnsi="Times New Roman" w:cs="Times New Roman" w:eastAsia="Times New Roman"/>
-          <w:sz w:val="24"/>
-        </w:rPr>
-        <w:t xml:space="preserve"> (price-like, flat, burden; largest deviation over all policies and horizons), and whose seed-to-seed SD of mean cost is at most 0.23 units. Per-patient cost varies: at the matched rate its SD is 0.6 to 2.8 units under price-like costs, against 0.5 to 3.0 for the adaptive policies at their own cost, so the two spend with comparable spread. The same procedure is applied separately under each regime, with that regime’s cost weights and its own matched rate. Acquisition-rate disparities are tested with a bootstrap over subgroups and corrected for multiplicity using the Benjamini-Hochberg procedure [16]; with dozens of (policy, modality) comparisons, uncorrected significance is not evidence. Calibration is reported as slope, intercept and Brier score, and clinical utility as net benefit across threshold probabilities [17].</w:t>
+        <w:t xml:space="preserve"> cost, not a strict budget. Matched random’s mean cost over seeds is within 0.03, 0.01 and 0.05 units of the policy’s (price-like, flat, burden; worst case), with a seed-to-seed SD of at most 0.23. Per-patient cost SD is 0.6 to 2.8 units for matched random against 0.5 to 3.0 for the adaptive policies (price-like), and the same procedure is applied separately under each regime. Acquisition-rate disparities are tested with a bootstrap over subgroups and corrected for multiplicity using the Benjamini-Hochberg procedure [16]; with dozens of (policy, modality) comparisons, uncorrected significance is not evidence. Calibration is reported as slope, intercept and Brier score, and clinical utility as net benefit across threshold probabilities [17].</w:t>
       </w:r>
     </w:p>
     <w:p>
@@ -5686,37 +5617,7 @@
           <w:rFonts w:ascii="Times New Roman" w:hAnsi="Times New Roman" w:cs="Times New Roman" w:eastAsia="Times New Roman"/>
           <w:sz w:val="24"/>
         </w:rPr>
-        <w:t xml:space="preserve">. We report unadjusted and Holm-adjusted results separately (Section 3.6). Of the 27 configuration-horizon pairs for the published policies under price-like costs, </w:t>
-      </w:r>
-      <w:r>
-        <w:rPr>
-          <w:rFonts w:ascii="Times New Roman" w:hAnsi="Times New Roman" w:cs="Times New Roman" w:eastAsia="Times New Roman"/>
-          <w:i/>
-          <w:sz w:val="24"/>
-        </w:rPr>
-        <w:t>unadjusted</w:t>
-      </w:r>
-      <w:r>
-        <w:rPr>
-          <w:rFonts w:ascii="Times New Roman" w:hAnsi="Times New Roman" w:cs="Times New Roman" w:eastAsia="Times New Roman"/>
-          <w:sz w:val="24"/>
-        </w:rPr>
-        <w:t xml:space="preserve">, 22 had a paired 95% interval including zero, 2 were better and 3 were worse. </w:t>
-      </w:r>
-      <w:r>
-        <w:rPr>
-          <w:rFonts w:ascii="Times New Roman" w:hAnsi="Times New Roman" w:cs="Times New Roman" w:eastAsia="Times New Roman"/>
-          <w:i/>
-          <w:sz w:val="24"/>
-        </w:rPr>
-        <w:t>After Holm adjustment</w:t>
-      </w:r>
-      <w:r>
-        <w:rPr>
-          <w:rFonts w:ascii="Times New Roman" w:hAnsi="Times New Roman" w:cs="Times New Roman" w:eastAsia="Times New Roman"/>
-          <w:sz w:val="24"/>
-        </w:rPr>
-        <w:t xml:space="preserve">, 25 of 27 showed no significant difference: one was better (the RL policy at cost weight 0.05 at 12 months, AUC +0.040, 95% CI +0.016 to +0.066, adjusted </w:t>
+        <w:t xml:space="preserve"> (unadjusted and Holm-adjusted results are reported separately; Section 3.6). Of the 27 published-policy pairs under price-like costs, unadjusted, 22 had an interval including zero, 2 were better and 3 worse. After Holm adjustment 25 of 27 showed no significant difference: one was better (RL, cost weight 0.05, 12 months: +0.040, 95% CI +0.016 to +0.066, adjusted </w:t>
       </w:r>
       <m:oMath>
         <m:r>
@@ -5737,7 +5638,7 @@
           <w:rFonts w:ascii="Times New Roman" w:hAnsi="Times New Roman" w:cs="Times New Roman" w:eastAsia="Times New Roman"/>
           <w:sz w:val="24"/>
         </w:rPr>
-        <w:t xml:space="preserve">, which did not recur at 24 or 36 months) and one was worse (the staged evidential method’s full ladder with its own neural predictor at 12 months, −0.169, adjusted </w:t>
+        <w:t xml:space="preserve">; not repeated at 24 or 36 months) and one worse (staged evidential full ladder with its own neural predictor, 12 months: −0.169, adjusted </w:t>
       </w:r>
       <m:oMath>
         <m:r>
@@ -5758,7 +5659,7 @@
           <w:rFonts w:ascii="Times New Roman" w:hAnsi="Times New Roman" w:cs="Times New Roman" w:eastAsia="Times New Roman"/>
           <w:sz w:val="24"/>
         </w:rPr>
-        <w:t xml:space="preserve">). The other three unadjusted differences did not survive adjustment: losses of the evidential method’s MRI-then-amyloid variant with its own predictor at 12 and 24 months (adjusted </w:t>
+        <w:t xml:space="preserve">). The other three unadjusted differences did not survive adjustment: two losses of the evidential MRI-then-amyloid variant with its own predictor (adjusted </w:t>
       </w:r>
       <m:oMath>
         <m:r>
@@ -5779,7 +5680,7 @@
           <w:rFonts w:ascii="Times New Roman" w:hAnsi="Times New Roman" w:cs="Times New Roman" w:eastAsia="Times New Roman"/>
           <w:sz w:val="24"/>
         </w:rPr>
-        <w:t xml:space="preserve"> and 0.10) and a gain of the 25%-escalation uncertainty cascade at 36 months (+0.028, 95% CI +0.002 to +0.053, adjusted </w:t>
+        <w:t xml:space="preserve"> and 0.10) and a gain of the 25%-escalation cascade at 36 months (+0.028, adjusted </w:t>
       </w:r>
       <m:oMath>
         <m:r>
@@ -5800,7 +5701,7 @@
           <w:rFonts w:ascii="Times New Roman" w:hAnsi="Times New Roman" w:cs="Times New Roman" w:eastAsia="Times New Roman"/>
           <w:sz w:val="24"/>
         </w:rPr>
-        <w:t xml:space="preserve">). All three unadjusted losses were evidential variants using that method’s own neural predictor, which is weaker than logistic regression at this sample size (Section 3.4). Under flat costs, 1 pair was better and 3 worse unadjusted, and after adjustment none was better and one worse (the same evidential full ladder); the RL gain at 12 months is not significant after adjustment under flat costs (adjusted </w:t>
+        <w:t xml:space="preserve">). All unadjusted losses used the evidential method’s own neural predictor, which is weaker than logistic regression at this sample size (Section 3.4). Under flat costs none was better and one worse after adjustment (the same evidential ladder; the RL gain has adjusted </w:t>
       </w:r>
       <m:oMath>
         <m:r>
@@ -5821,7 +5722,7 @@
           <w:rFonts w:ascii="Times New Roman" w:hAnsi="Times New Roman" w:cs="Times New Roman" w:eastAsia="Times New Roman"/>
           <w:sz w:val="24"/>
         </w:rPr>
-        <w:t xml:space="preserve">). Under burden costs, 4 were better and 2 worse unadjusted, and after adjustment 2 were better (the same RL gain, adjusted </w:t>
+        <w:t xml:space="preserve">). Under burden costs two were better (the RL gain, adjusted </w:t>
       </w:r>
       <m:oMath>
         <m:r>
@@ -5863,7 +5764,7 @@
           <w:rFonts w:ascii="Times New Roman" w:hAnsi="Times New Roman" w:cs="Times New Roman" w:eastAsia="Times New Roman"/>
           <w:sz w:val="24"/>
         </w:rPr>
-        <w:t>) and one worse. The gains therefore depend on the cost regime, and neither recurs across horizons.</w:t>
+        <w:t>) and one worse. The gains depend on the cost regime and neither recurs across horizons.</w:t>
       </w:r>
     </w:p>
     <w:p>
@@ -6972,7 +6873,7 @@
       <w:r>
         <w:drawing>
           <wp:inline xmlns:a="http://schemas.openxmlformats.org/drawingml/2006/main" xmlns:pic="http://schemas.openxmlformats.org/drawingml/2006/picture">
-            <wp:extent cx="5562000" cy="2462518"/>
+            <wp:extent cx="5148000" cy="2279224"/>
             <wp:docPr id="3" name="Picture 3"/>
             <wp:cNvGraphicFramePr>
               <a:graphicFrameLocks noChangeAspect="1"/>
@@ -6993,7 +6894,7 @@
                   <pic:spPr>
                     <a:xfrm>
                       <a:off x="0" y="0"/>
-                      <a:ext cx="5562000" cy="2462518"/>
+                      <a:ext cx="5148000" cy="2279224"/>
                     </a:xfrm>
                     <a:prstGeom prst="rect"/>
                   </pic:spPr>
@@ -7035,7 +6936,7 @@
       <w:r>
         <w:drawing>
           <wp:inline xmlns:a="http://schemas.openxmlformats.org/drawingml/2006/main" xmlns:pic="http://schemas.openxmlformats.org/drawingml/2006/picture">
-            <wp:extent cx="5612400" cy="2515062"/>
+            <wp:extent cx="5148000" cy="2306953"/>
             <wp:docPr id="4" name="Picture 4"/>
             <wp:cNvGraphicFramePr>
               <a:graphicFrameLocks noChangeAspect="1"/>
@@ -7056,7 +6957,7 @@
                   <pic:spPr>
                     <a:xfrm>
                       <a:off x="0" y="0"/>
-                      <a:ext cx="5612400" cy="2515062"/>
+                      <a:ext cx="5148000" cy="2306953"/>
                     </a:xfrm>
                     <a:prstGeom prst="rect"/>
                   </pic:spPr>
@@ -7165,7 +7066,7 @@
       <w:r>
         <w:drawing>
           <wp:inline xmlns:a="http://schemas.openxmlformats.org/drawingml/2006/main" xmlns:pic="http://schemas.openxmlformats.org/drawingml/2006/picture">
-            <wp:extent cx="5587200" cy="2493360"/>
+            <wp:extent cx="5148000" cy="2297362"/>
             <wp:docPr id="5" name="Picture 5"/>
             <wp:cNvGraphicFramePr>
               <a:graphicFrameLocks noChangeAspect="1"/>
@@ -7186,7 +7087,7 @@
                   <pic:spPr>
                     <a:xfrm>
                       <a:off x="0" y="0"/>
-                      <a:ext cx="5587200" cy="2493360"/>
+                      <a:ext cx="5148000" cy="2297362"/>
                     </a:xfrm>
                     <a:prstGeom prst="rect"/>
                   </pic:spPr>
@@ -7268,146 +7169,20 @@
           <w:rFonts w:ascii="Times New Roman" w:hAnsi="Times New Roman" w:cs="Times New Roman" w:eastAsia="Times New Roman"/>
           <w:sz w:val="24"/>
         </w:rPr>
-        <w:t>Two further checks probe the negative result; both give every policy the same 12-measure MRI block as the main benchmark. Replacing the shared logistic regression with gradient boosting did not rescue the published policies: at 24 months two of the three representative configurations (the uncertainty cascade and RL at cost weight 0.05) were dominated, and the staged evidential method was not (0.868 at cost 4.6, against 0.855 for fixed MRI+FDG at 3.0 and 0.881 for acquire-all at 9.5). Gradient boosting lowered AUC for every policy, by 0.010 (evidential) to 0.055 (RL) and by 0.031 for fixed MRI+FDG (Figure 6b), so logistic regression was the stronger predictor at this sample size. Across random seeds 0, 7 and 42, per-policy AUC standard deviations (SDs) were 0.004–0.014 (Figure 6a); the ranking shifted between seeds, but acquire-all ranked first and fixed MRI and cheap-only last at every seed, and the best published policy ranked second at one seed and below fixed MRI+FDG at the other two.</w:t>
+        <w:t>Two further checks probe the negative result; both give every policy the same 12-measure MRI block as the main benchmark. Replacing the shared logistic regression with gradient boosting did not rescue the published policies: at 24 months two of the three representative configurations (the uncertainty cascade and RL at cost weight 0.05) were dominated, and the staged evidential method was not (0.868 at cost 4.6, against 0.855 for fixed MRI+FDG at 3.0 and 0.881 for acquire-all at 9.5). Gradient boosting lowered AUC for every policy, by 0.010 (evidential) to 0.055 (RL) and by 0.031 for fixed MRI+FDG (Supplementary Figure S4b), so logistic regression was the stronger predictor at this sample size. Across random seeds 0, 7 and 42, per-policy AUC standard deviations (SDs) were 0.004–0.014 (Supplementary Figure S4a); the ranking shifted between seeds, but acquire-all ranked first and fixed MRI and cheap-only last at every seed, and the best published policy ranked second at one seed and below fixed MRI+FDG at the other two.</w:t>
       </w:r>
     </w:p>
     <w:p>
       <w:pPr>
-        <w:keepNext/>
-        <w:spacing w:line="240" w:lineRule="auto" w:before="400" w:after="100"/>
-        <w:jc w:val="center"/>
-      </w:pPr>
-      <w:r>
-        <w:drawing>
-          <wp:inline xmlns:a="http://schemas.openxmlformats.org/drawingml/2006/main" xmlns:pic="http://schemas.openxmlformats.org/drawingml/2006/picture">
-            <wp:extent cx="5724000" cy="2565100"/>
-            <wp:docPr id="6" name="Picture 6"/>
-            <wp:cNvGraphicFramePr>
-              <a:graphicFrameLocks noChangeAspect="1"/>
-            </wp:cNvGraphicFramePr>
-            <a:graphic>
-              <a:graphicData uri="http://schemas.openxmlformats.org/drawingml/2006/picture">
-                <pic:pic>
-                  <pic:nvPicPr>
-                    <pic:cNvPr id="0" name="fig5_robustness.png"/>
-                    <pic:cNvPicPr/>
-                  </pic:nvPicPr>
-                  <pic:blipFill>
-                    <a:blip r:embed="rId20"/>
-                    <a:stretch>
-                      <a:fillRect/>
-                    </a:stretch>
-                  </pic:blipFill>
-                  <pic:spPr>
-                    <a:xfrm>
-                      <a:off x="0" y="0"/>
-                      <a:ext cx="5724000" cy="2565100"/>
-                    </a:xfrm>
-                    <a:prstGeom prst="rect"/>
-                  </pic:spPr>
-                </pic:pic>
-              </a:graphicData>
-            </a:graphic>
-          </wp:inline>
-        </w:drawing>
-      </w:r>
-    </w:p>
-    <w:p>
-      <w:pPr>
-        <w:keepLines/>
-        <w:spacing w:line="240" w:lineRule="auto" w:before="100" w:after="400"/>
-        <w:jc w:val="center"/>
-      </w:pPr>
-      <w:r>
-        <w:rPr>
-          <w:rFonts w:ascii="Times New Roman" w:hAnsi="Times New Roman" w:cs="Times New Roman" w:eastAsia="Times New Roman"/>
-          <w:b/>
-          <w:sz w:val="24"/>
-        </w:rPr>
-        <w:t>Figure 6.</w:t>
-      </w:r>
+        <w:pStyle w:val="IROParag"/>
+        <w:spacing w:line="240" w:lineRule="auto"/>
+      </w:pPr>
       <w:r>
         <w:rPr>
           <w:rFonts w:ascii="Times New Roman" w:hAnsi="Times New Roman" w:cs="Times New Roman" w:eastAsia="Times New Roman"/>
           <w:sz w:val="24"/>
         </w:rPr>
-        <w:t xml:space="preserve"> (a) Seed robustness at 24 months: dots are seeds 0, 7 and 42; the bar is mean ± SD. (b) AUC under the shared logistic regression and under gradient boosting on the same 366-subject cohort (seed 42). Both panels use the 12-measure MRI block.</w:t>
-      </w:r>
-    </w:p>
-    <w:p>
-      <w:pPr>
-        <w:pStyle w:val="IROParag"/>
-        <w:spacing w:line="240" w:lineRule="auto"/>
-      </w:pPr>
-      <w:r>
-        <w:rPr>
-          <w:rFonts w:ascii="Times New Roman" w:hAnsi="Times New Roman" w:cs="Times New Roman" w:eastAsia="Times New Roman"/>
-          <w:sz w:val="24"/>
-        </w:rPr>
-        <w:t>Decision-curve analysis extended the comparison to clinical utility (Figure 7a). Every strategy delivered a clear net benefit over treating everyone at thresholds of 0.10 and above, and no published policy led consistently: the highest net benefit came from acquire-all at four of the ten thresholds (0.05, 0.15, 0.20 and 0.30), fixed MRI+FDG at 0.10, the uncertainty cascade at 0.25, and SPFA with MRI+FDG at 0.35–0.50. Where a published policy exceeded the best reference strategy (thresholds 0.25, 0.35 and 0.40) it did so by at most 0.005. Calibration slopes did not favour the published policies either: cheap-only was the best calibrated reference (slope 0.828), random acquisition scored 0.780, the three published policies ranged from 0.733 to 0.756, and acquire-all was the worst (0.725); SPFA was closest to ideal (1.080 and 1.104). Figure 7b shows reliability curves for the reference strategies and SPFA.</w:t>
-      </w:r>
-    </w:p>
-    <w:p>
-      <w:pPr>
-        <w:keepNext/>
-        <w:spacing w:line="240" w:lineRule="auto" w:before="400" w:after="100"/>
-        <w:jc w:val="center"/>
-      </w:pPr>
-      <w:r>
-        <w:drawing>
-          <wp:inline xmlns:a="http://schemas.openxmlformats.org/drawingml/2006/main" xmlns:pic="http://schemas.openxmlformats.org/drawingml/2006/picture">
-            <wp:extent cx="5468400" cy="2712863"/>
-            <wp:docPr id="7" name="Picture 7"/>
-            <wp:cNvGraphicFramePr>
-              <a:graphicFrameLocks noChangeAspect="1"/>
-            </wp:cNvGraphicFramePr>
-            <a:graphic>
-              <a:graphicData uri="http://schemas.openxmlformats.org/drawingml/2006/picture">
-                <pic:pic>
-                  <pic:nvPicPr>
-                    <pic:cNvPr id="0" name="fig6_clinical_utility.png"/>
-                    <pic:cNvPicPr/>
-                  </pic:nvPicPr>
-                  <pic:blipFill>
-                    <a:blip r:embed="rId21"/>
-                    <a:stretch>
-                      <a:fillRect/>
-                    </a:stretch>
-                  </pic:blipFill>
-                  <pic:spPr>
-                    <a:xfrm>
-                      <a:off x="0" y="0"/>
-                      <a:ext cx="5468400" cy="2712863"/>
-                    </a:xfrm>
-                    <a:prstGeom prst="rect"/>
-                  </pic:spPr>
-                </pic:pic>
-              </a:graphicData>
-            </a:graphic>
-          </wp:inline>
-        </w:drawing>
-      </w:r>
-    </w:p>
-    <w:p>
-      <w:pPr>
-        <w:keepLines/>
-        <w:spacing w:line="240" w:lineRule="auto" w:before="100" w:after="400"/>
-        <w:jc w:val="center"/>
-      </w:pPr>
-      <w:r>
-        <w:rPr>
-          <w:rFonts w:ascii="Times New Roman" w:hAnsi="Times New Roman" w:cs="Times New Roman" w:eastAsia="Times New Roman"/>
-          <w:b/>
-          <w:sz w:val="24"/>
-        </w:rPr>
-        <w:t>Figure 7.</w:t>
-      </w:r>
-      <w:r>
-        <w:rPr>
-          <w:rFonts w:ascii="Times New Roman" w:hAnsi="Times New Roman" w:cs="Times New Roman" w:eastAsia="Times New Roman"/>
-          <w:sz w:val="24"/>
-        </w:rPr>
-        <w:t xml:space="preserve"> (a) Net benefit across threshold probabilities in the 24-month benchmark, with treat-all and treat-none references (RL policy not shown, for legibility). (b) Reliability diagram: mean predicted risk against observed conversion rate within risk bins.</w:t>
+        <w:t>Decision-curve analysis (Supplementary Figure S1a) showed a clear net benefit over treating everyone at thresholds of 0.10 and above for every strategy, and no published policy led consistently: the highest net benefit came from acquire-all at four of the ten thresholds, fixed MRI+FDG at 0.10, the uncertainty cascade at 0.25 and SPFA with MRI+FDG at 0.35–0.50, and where a published policy beat the best reference (thresholds 0.25, 0.35 and 0.40) it did so by at most 0.005. Calibration slopes did not favour the published policies either (0.733 to 0.756, against 0.828 for cheap-only, 0.780 for random and 0.725 for acquire-all); SPFA was closest to ideal (1.080 and 1.104; Supplementary Figure S1b).</w:t>
       </w:r>
     </w:p>
     <w:p>
@@ -8362,24 +8137,11 @@
           <w:rFonts w:ascii="Times New Roman" w:hAnsi="Times New Roman" w:cs="Times New Roman" w:eastAsia="Times New Roman"/>
           <w:sz w:val="24"/>
         </w:rPr>
-        <w:t>An ablation separates the two ingredients (Figure 8), relative to the three-feature block trained on complete cases. At the 24-month horizon, the combination improves the MRI-only state by +0.034 AUC (95% CI +0.007 to +0.063). Pooled training alone gives +0.019 (+0.004 to +0.036), whose interval also excludes zero, and the expanded features alone +0.013 (−0.011 to +0.039), whose interval includes zero, so the significant part of the gain at this state is attributable to pooling. At richer acquisition states (MRI+FDG or more) the changes are within noise (at most +0.007) and slightly negative at the amyloid state (−0.009, interval including zero), so the benefit is concentrated at the cheap end of the frontier, which is where it matters for cost. Because the main benchmark already gives every policy the expanded block, the gap between SPFA and the fixed rules in Table 3 reflects pooling alone: +0.021 AUC for MRI-only at 24 months (95% CI +0.001 to +0.042), significant only at the margin.</w:t>
+        <w:t>An ablation separates the two ingredients (Figure 6), relative to the three-feature block trained on complete cases. At the 24-month horizon, the combination improves the MRI-only state by +0.034 AUC (95% CI +0.007 to +0.063). Pooled training alone gives +0.019 (+0.004 to +0.036), whose interval also excludes zero, and the expanded features alone +0.013 (−0.011 to +0.039), whose interval includes zero, so the significant part of the gain at this state is attributable to pooling. At richer acquisition states (MRI+FDG or more) the changes are within noise (at most +0.007) and slightly negative at the amyloid state (−0.009, interval including zero), so the benefit is concentrated at the cheap end of the frontier, which is where it matters for cost. Because the main benchmark already gives every policy the expanded block, the gap between SPFA and the fixed rules in Table 3 reflects pooling alone: +0.021 AUC for MRI-only at 24 months (95% CI +0.001 to +0.042), significant only at the margin.</w:t>
       </w:r>
     </w:p>
     <w:p>
       <w:pPr>
-        <w:pStyle w:val="IROParag"/>
-        <w:spacing w:line="240" w:lineRule="auto"/>
-      </w:pPr>
-      <w:r>
-        <w:rPr>
-          <w:rFonts w:ascii="Times New Roman" w:hAnsi="Times New Roman" w:cs="Times New Roman" w:eastAsia="Times New Roman"/>
-          <w:sz w:val="24"/>
-        </w:rPr>
-        <w:t>On the held-out test set (scored at the end on two releases; Section 3.2), SPFA with MRI only reached AUC 0.944, 0.908 and 0.855 at 12, 24 and 36 months against acquire-all’s 0.928, 0.922 and 0.944. Paired against acquire-all, neither SPFA operating point was significantly worse at any horizon. The weakest case is MRI-only at 36 months (−0.089, 95% CI −0.186 to +0.000), where the upper limit sits at zero to three decimals; this weakness was visible in development and is reported rather than rounded away (Figure 9).</w:t>
-      </w:r>
-    </w:p>
-    <w:p>
-      <w:pPr>
         <w:keepNext/>
         <w:spacing w:line="240" w:lineRule="auto" w:before="400" w:after="100"/>
         <w:jc w:val="center"/>
@@ -8387,8 +8149,8 @@
       <w:r>
         <w:drawing>
           <wp:inline xmlns:a="http://schemas.openxmlformats.org/drawingml/2006/main" xmlns:pic="http://schemas.openxmlformats.org/drawingml/2006/picture">
-            <wp:extent cx="5724000" cy="2557532"/>
-            <wp:docPr id="8" name="Picture 8"/>
+            <wp:extent cx="5148000" cy="2300170"/>
+            <wp:docPr id="6" name="Picture 6"/>
             <wp:cNvGraphicFramePr>
               <a:graphicFrameLocks noChangeAspect="1"/>
             </wp:cNvGraphicFramePr>
@@ -8400,7 +8162,7 @@
                     <pic:cNvPicPr/>
                   </pic:nvPicPr>
                   <pic:blipFill>
-                    <a:blip r:embed="rId22"/>
+                    <a:blip r:embed="rId20"/>
                     <a:stretch>
                       <a:fillRect/>
                     </a:stretch>
@@ -8408,7 +8170,7 @@
                   <pic:spPr>
                     <a:xfrm>
                       <a:off x="0" y="0"/>
-                      <a:ext cx="5724000" cy="2557532"/>
+                      <a:ext cx="5148000" cy="2300170"/>
                     </a:xfrm>
                     <a:prstGeom prst="rect"/>
                   </pic:spPr>
@@ -8431,7 +8193,7 @@
           <w:b/>
           <w:sz w:val="24"/>
         </w:rPr>
-        <w:t>Figure 8.</w:t>
+        <w:t>Figure 6.</w:t>
       </w:r>
       <w:r>
         <w:rPr>
@@ -8451,7 +8213,7 @@
           <w:rFonts w:ascii="Times New Roman" w:hAnsi="Times New Roman" w:cs="Times New Roman" w:eastAsia="Times New Roman"/>
           <w:sz w:val="24"/>
         </w:rPr>
-        <w:t>Three cautions attach to the test figures. The test sets are small (9, 17 and 22 converters), so “not significantly worse” is weak evidence of equivalence: the intervals are compatible with losses of up to 0.186 AUC for MRI-only at 36 months. For the two SPFA operating points, test AUC differed from the nested development estimate by −0.005 to +0.072 (largest for MRI-only at 12 months: 0.944 against 0.872), and the 12-month test set appears easier overall: all five models scored 0.066 to 0.099 above their development estimates, including cheap-only (+0.099). Two post hoc, descriptive checks (nothing was tuned on them) put this in context. First, we drew 20,000 random subsets of the development out-of-fold predictions with the same size and number of converters as each test set. The standard deviation of AUC across such subsets is 0.04–0.06 at 12 months and 0.03–0.05 at 24 and 36 months, and the observed 12-month test AUCs fall at the 92nd to 99th percentile of that distribution (24 and 36 months: 41st to 95th, with acquire-all at 36 months the highest at 94.5th); the five models share the same test subjects, so these percentiles are not independent. A 12-month gap of this size is therefore unusual but not implausible for nine converters. Second, test and development subjects were similar at baseline: standardised mean differences in age, education, MMSE, CDR-SB, APOE4 and hippocampal and ventricular volume were at most 0.23 in magnitude, and outcome prevalence matched (9.0% against 8.9%, 18.3% against 18.5%, and 25.7% against 26.2% at 12, 24 and 36 months). We therefore attribute the differences to small-sample variation rather than a real gain, but cannot exclude other causes; the nested figures in Table 4 are the ones to quote as expected performance. As a check on leakage, test subjects are excluded from the training pool by construction and the split asserts that no subject appears in two partitions; operating points, feature blocks and the regularisation grid were fixed before the test set was scored, and it was scored at the end on two releases (Section 3.2).</w:t>
+        <w:t>On the held-out test set (scored at the end on two releases; Section 3.2), SPFA with MRI only reached AUC 0.944, 0.908 and 0.855 at 12, 24 and 36 months against acquire-all’s 0.928, 0.922 and 0.944. Paired against acquire-all, neither SPFA operating point was significantly worse at any horizon. The weakest case is MRI-only at 36 months (−0.089, 95% CI −0.186 to +0.000), where the upper limit sits at zero to three decimals; this weakness was visible in development and is reported rather than rounded away (Figure 7).</w:t>
       </w:r>
     </w:p>
     <w:p>
@@ -8464,7 +8226,7 @@
         <w:drawing>
           <wp:inline xmlns:a="http://schemas.openxmlformats.org/drawingml/2006/main" xmlns:pic="http://schemas.openxmlformats.org/drawingml/2006/picture">
             <wp:extent cx="5256000" cy="2972359"/>
-            <wp:docPr id="9" name="Picture 9"/>
+            <wp:docPr id="7" name="Picture 7"/>
             <wp:cNvGraphicFramePr>
               <a:graphicFrameLocks noChangeAspect="1"/>
             </wp:cNvGraphicFramePr>
@@ -8476,7 +8238,7 @@
                     <pic:cNvPicPr/>
                   </pic:nvPicPr>
                   <pic:blipFill>
-                    <a:blip r:embed="rId23"/>
+                    <a:blip r:embed="rId21"/>
                     <a:stretch>
                       <a:fillRect/>
                     </a:stretch>
@@ -8507,7 +8269,7 @@
           <w:b/>
           <w:sz w:val="24"/>
         </w:rPr>
-        <w:t>Figure 9.</w:t>
+        <w:t>Figure 7.</w:t>
       </w:r>
       <w:r>
         <w:rPr>
@@ -8515,6 +8277,19 @@
           <w:sz w:val="24"/>
         </w:rPr>
         <w:t xml:space="preserve"> Held-out test AUC with 95% bootstrap CI for the proposed SPFA operating points (“ours”), fixed MRI+FDG (expanded MRI block, complete-case training), cheap-only and acquire-all, at the 12-, 24- and 36-month horizons. Intervals overlap throughout because the test sets contain only 9, 17 and 22 converters.</w:t>
+      </w:r>
+    </w:p>
+    <w:p>
+      <w:pPr>
+        <w:pStyle w:val="IROParag"/>
+        <w:spacing w:line="240" w:lineRule="auto"/>
+      </w:pPr>
+      <w:r>
+        <w:rPr>
+          <w:rFonts w:ascii="Times New Roman" w:hAnsi="Times New Roman" w:cs="Times New Roman" w:eastAsia="Times New Roman"/>
+          <w:sz w:val="24"/>
+        </w:rPr>
+        <w:t>Three cautions attach to the test figures. The test sets are small (9, 17 and 22 converters), so “not significantly worse” is weak evidence of equivalence: the intervals are compatible with losses of up to 0.186 AUC for MRI-only at 36 months. For the two SPFA operating points, test AUC differed from the nested development estimate by −0.005 to +0.072 (largest for MRI-only at 12 months: 0.944 against 0.872), and the 12-month test set appears easier overall: all five models scored 0.066 to 0.099 above their development estimates, including cheap-only (+0.099). Two post hoc, descriptive checks (nothing was tuned on them) put this in context. First, 20,000 random subsets of the development out-of-fold predictions with each test set’s size and number of converters have an AUC standard deviation of 0.04–0.06 at 12 months and 0.03–0.05 at 24 and 36; the 12-month test AUCs fall at the 92nd to 99th percentile of that distribution (24 and 36 months: 41st to 95th), and since the five models share test subjects these percentiles are not independent. Second, test and development subjects were similar at baseline (standardised mean differences in age, education, MMSE, CDR-SB, APOE4 and hippocampal and ventricular volume at most 0.23; outcome prevalence 9.0% against 8.9%, 18.3% against 18.5% and 25.7% against 26.2%). We therefore attribute the differences to small-sample variation rather than a real gain, but cannot exclude other causes; the nested figures in Table 4 are the ones to quote as expected performance. Test subjects are excluded from the training pool by construction, the split asserts that no subject appears in two partitions, and operating points, feature blocks and the regularisation grid were fixed before the test set was scored.</w:t>
       </w:r>
     </w:p>
     <w:p>
@@ -8553,7 +8328,7 @@
           <w:rFonts w:ascii="Times New Roman" w:hAnsi="Times New Roman" w:cs="Times New Roman" w:eastAsia="Times New Roman"/>
           <w:sz w:val="24"/>
         </w:rPr>
-        <w:t>The complete-case multimodal design this literature relies on has a demographic cost that is not usually reported. Table 6 traces it, and Figure 10a plots the same attrition alongside cohort size.</w:t>
+        <w:t>The complete-case multimodal design this literature relies on has a demographic cost that is not usually reported. Table 6 traces it, and Supplementary Figure S5a plots the same attrition alongside cohort size.</w:t>
       </w:r>
     </w:p>
     <w:p>
@@ -9002,70 +8777,7 @@
           <w:rFonts w:ascii="Times New Roman" w:hAnsi="Times New Roman" w:cs="Times New Roman" w:eastAsia="Times New Roman"/>
           <w:sz w:val="24"/>
         </w:rPr>
-        <w:t>Requiring an outcome label removes 61% of non-White participants (222 to 86), and requiring complete modalities removes most of the remainder (to 27). The mechanism is identifiable: among MCI participants, ADNI’s most recent phase (ADNI4) is 38.8% non-White, against 6.3–9.4% in ADNI1, ADNI-GO and ADNI2, a substantial recruitment improvement, but only 16.3% of its participants yet have 24-month follow-up (48–87% in earlier phases). ADNI’s diversity gains are therefore structurally invisible to conversion-prediction studies at present. Figure 10b shows how thin the non-White strata are in the audit cohort itself.</w:t>
-      </w:r>
-    </w:p>
-    <w:p>
-      <w:pPr>
-        <w:keepNext/>
-        <w:spacing w:line="240" w:lineRule="auto" w:before="400" w:after="100"/>
-        <w:jc w:val="center"/>
-      </w:pPr>
-      <w:r>
-        <w:drawing>
-          <wp:inline xmlns:a="http://schemas.openxmlformats.org/drawingml/2006/main" xmlns:pic="http://schemas.openxmlformats.org/drawingml/2006/picture">
-            <wp:extent cx="5583600" cy="2514449"/>
-            <wp:docPr id="10" name="Picture 10"/>
-            <wp:cNvGraphicFramePr>
-              <a:graphicFrameLocks noChangeAspect="1"/>
-            </wp:cNvGraphicFramePr>
-            <a:graphic>
-              <a:graphicData uri="http://schemas.openxmlformats.org/drawingml/2006/picture">
-                <pic:pic>
-                  <pic:nvPicPr>
-                    <pic:cNvPr id="0" name="fig9_attrition.png"/>
-                    <pic:cNvPicPr/>
-                  </pic:nvPicPr>
-                  <pic:blipFill>
-                    <a:blip r:embed="rId24"/>
-                    <a:stretch>
-                      <a:fillRect/>
-                    </a:stretch>
-                  </pic:blipFill>
-                  <pic:spPr>
-                    <a:xfrm>
-                      <a:off x="0" y="0"/>
-                      <a:ext cx="5583600" cy="2514449"/>
-                    </a:xfrm>
-                    <a:prstGeom prst="rect"/>
-                  </pic:spPr>
-                </pic:pic>
-              </a:graphicData>
-            </a:graphic>
-          </wp:inline>
-        </w:drawing>
-      </w:r>
-    </w:p>
-    <w:p>
-      <w:pPr>
-        <w:keepLines/>
-        <w:spacing w:line="240" w:lineRule="auto" w:before="100" w:after="400"/>
-        <w:jc w:val="center"/>
-      </w:pPr>
-      <w:r>
-        <w:rPr>
-          <w:rFonts w:ascii="Times New Roman" w:hAnsi="Times New Roman" w:cs="Times New Roman" w:eastAsia="Times New Roman"/>
-          <w:b/>
-          <w:sz w:val="24"/>
-        </w:rPr>
-        <w:t>Figure 10.</w:t>
-      </w:r>
-      <w:r>
-        <w:rPr>
-          <w:rFonts w:ascii="Times New Roman" w:hAnsi="Times New Roman" w:cs="Times New Roman" w:eastAsia="Times New Roman"/>
-          <w:sz w:val="24"/>
-        </w:rPr>
-        <w:t xml:space="preserve"> (a) Cohort size (blue bars, left axis) and non-White representation (orange line, right axis) at each stage of complete-case cohort construction, 24 months. (b) Participants by self-reported race in the 24-month audit cohort; grey bars mark groups too small for stratified inference.</w:t>
+        <w:t>Requiring an outcome label removes 61% of non-White participants (222 to 86), and requiring complete modalities removes most of the remainder (to 27). The mechanism is identifiable: among MCI participants, ADNI’s most recent phase (ADNI4) is 38.8% non-White, against 6.3–9.4% in ADNI1, ADNI-GO and ADNI2, a substantial recruitment improvement, but only 16.3% of its participants yet have 24-month follow-up (48–87% in earlier phases). ADNI’s diversity gains are therefore structurally invisible to conversion-prediction studies at present. Supplementary Figure S5b shows how thin the non-White strata are in the audit cohort itself.</w:t>
       </w:r>
     </w:p>
     <w:p>
@@ -9099,112 +8811,7 @@
           <w:rFonts w:ascii="Times New Roman" w:hAnsi="Times New Roman" w:cs="Times New Roman" w:eastAsia="Times New Roman"/>
           <w:sz w:val="24"/>
         </w:rPr>
-        <w:t xml:space="preserve"> uncorrected – the evidential method ordering FDG-PET 10.0 percentage points less often for male participants, and the RL policy (cost weight 0.05) ordering 0.23 more modalities per male participant – but neither survived Benjamini-Hochberg across the comparison family, and they are reported as suggestive only (Figure 11). We note that fixed policies cannot exhibit acquisition disparity at all, since they do not consult the patient.</w:t>
-      </w:r>
-    </w:p>
-    <w:p>
-      <w:pPr>
-        <w:keepNext/>
-        <w:spacing w:line="240" w:lineRule="auto" w:before="400" w:after="100"/>
-        <w:jc w:val="center"/>
-      </w:pPr>
-      <w:r>
-        <w:drawing>
-          <wp:inline xmlns:a="http://schemas.openxmlformats.org/drawingml/2006/main" xmlns:pic="http://schemas.openxmlformats.org/drawingml/2006/picture">
-            <wp:extent cx="5583600" cy="2200524"/>
-            <wp:docPr id="11" name="Picture 11"/>
-            <wp:cNvGraphicFramePr>
-              <a:graphicFrameLocks noChangeAspect="1"/>
-            </wp:cNvGraphicFramePr>
-            <a:graphic>
-              <a:graphicData uri="http://schemas.openxmlformats.org/drawingml/2006/picture">
-                <pic:pic>
-                  <pic:nvPicPr>
-                    <pic:cNvPr id="0" name="fig_sex_acquisition.png"/>
-                    <pic:cNvPicPr/>
-                  </pic:nvPicPr>
-                  <pic:blipFill>
-                    <a:blip r:embed="rId25"/>
-                    <a:stretch>
-                      <a:fillRect/>
-                    </a:stretch>
-                  </pic:blipFill>
-                  <pic:spPr>
-                    <a:xfrm>
-                      <a:off x="0" y="0"/>
-                      <a:ext cx="5583600" cy="2200524"/>
-                    </a:xfrm>
-                    <a:prstGeom prst="rect"/>
-                  </pic:spPr>
-                </pic:pic>
-              </a:graphicData>
-            </a:graphic>
-          </wp:inline>
-        </w:drawing>
-      </w:r>
-    </w:p>
-    <w:p>
-      <w:pPr>
-        <w:keepLines/>
-        <w:spacing w:line="240" w:lineRule="auto" w:before="100" w:after="400"/>
-        <w:jc w:val="center"/>
-      </w:pPr>
-      <w:r>
-        <w:rPr>
-          <w:rFonts w:ascii="Times New Roman" w:hAnsi="Times New Roman" w:cs="Times New Roman" w:eastAsia="Times New Roman"/>
-          <w:b/>
-          <w:sz w:val="24"/>
-        </w:rPr>
-        <w:t>Figure 11.</w:t>
-      </w:r>
-      <w:r>
-        <w:rPr>
-          <w:rFonts w:ascii="Times New Roman" w:hAnsi="Times New Roman" w:cs="Times New Roman" w:eastAsia="Times New Roman"/>
-          <w:sz w:val="24"/>
-        </w:rPr>
-        <w:t xml:space="preserve"> Acquisition rate by modality and sex for the three published policies at 24 months (RL policy at cost weight 0.05; male </w:t>
-      </w:r>
-      <m:oMath>
-        <m:r>
-          <m:t>n</m:t>
-        </m:r>
-        <m:r>
-          <m:rPr>
-            <m:sty m:val="p"/>
-          </m:rPr>
-          <m:t>=</m:t>
-        </m:r>
-        <m:r>
-          <m:t>213</m:t>
-        </m:r>
-      </m:oMath>
-      <w:r>
-        <w:rPr>
-          <w:rFonts w:ascii="Times New Roman" w:hAnsi="Times New Roman" w:cs="Times New Roman" w:eastAsia="Times New Roman"/>
-          <w:sz w:val="24"/>
-        </w:rPr>
-        <w:t xml:space="preserve">, female </w:t>
-      </w:r>
-      <m:oMath>
-        <m:r>
-          <m:t>n</m:t>
-        </m:r>
-        <m:r>
-          <m:rPr>
-            <m:sty m:val="p"/>
-          </m:rPr>
-          <m:t>=</m:t>
-        </m:r>
-        <m:r>
-          <m:t>153</m:t>
-        </m:r>
-      </m:oMath>
-      <w:r>
-        <w:rPr>
-          <w:rFonts w:ascii="Times New Roman" w:hAnsi="Times New Roman" w:cs="Times New Roman" w:eastAsia="Times New Roman"/>
-          <w:sz w:val="24"/>
-        </w:rPr>
-        <w:t>). No gap survived Benjamini-Hochberg correction.</w:t>
+        <w:t xml:space="preserve"> uncorrected – the evidential method ordering FDG-PET 10.0 percentage points less often for male participants, and the RL policy (cost weight 0.05) ordering 0.23 more modalities per male participant – but neither survived Benjamini-Hochberg across the comparison family, and they are reported as suggestive only (Supplementary Figure S2). We note that fixed policies cannot exhibit acquisition disparity at all, since they do not consult the patient.</w:t>
       </w:r>
     </w:p>
     <w:p>
@@ -9243,70 +8850,7 @@
           <w:rFonts w:ascii="Times New Roman" w:hAnsi="Times New Roman" w:cs="Times New Roman" w:eastAsia="Times New Roman"/>
           <w:sz w:val="24"/>
         </w:rPr>
-        <w:t>A secondary analysis asked whether modality value depends on the prediction horizon, which would motivate horizon-conditioned policies. This analysis uses the same 12-measure MRI block as the main benchmark. On a fixed subject set, amyloid-PET and CSF showed a significant increase in incremental value from 12 to 36 months (+0.049, 95% CI +0.021 to +0.080, and +0.040, 95% CI +0.010 to +0.068); MRI and FDG did not (tau-PET, flagged underpowered, also increased). A horizon-conditioned policy built on this effect did not outperform horizon-swapped controls, indicating the effect is real as a measurement but not exploitable as an acquisition rule at this sample size. Figure 12 shows the incremental value of each modality by horizon (a) and on subjects matched to each modality, including all four together (b).</w:t>
-      </w:r>
-    </w:p>
-    <w:p>
-      <w:pPr>
-        <w:keepNext/>
-        <w:spacing w:line="240" w:lineRule="auto" w:before="400" w:after="100"/>
-        <w:jc w:val="center"/>
-      </w:pPr>
-      <w:r>
-        <w:drawing>
-          <wp:inline xmlns:a="http://schemas.openxmlformats.org/drawingml/2006/main" xmlns:pic="http://schemas.openxmlformats.org/drawingml/2006/picture">
-            <wp:extent cx="5580000" cy="2471535"/>
-            <wp:docPr id="12" name="Picture 12"/>
-            <wp:cNvGraphicFramePr>
-              <a:graphicFrameLocks noChangeAspect="1"/>
-            </wp:cNvGraphicFramePr>
-            <a:graphic>
-              <a:graphicData uri="http://schemas.openxmlformats.org/drawingml/2006/picture">
-                <pic:pic>
-                  <pic:nvPicPr>
-                    <pic:cNvPr id="0" name="fig11_horizon.png"/>
-                    <pic:cNvPicPr/>
-                  </pic:nvPicPr>
-                  <pic:blipFill>
-                    <a:blip r:embed="rId26"/>
-                    <a:stretch>
-                      <a:fillRect/>
-                    </a:stretch>
-                  </pic:blipFill>
-                  <pic:spPr>
-                    <a:xfrm>
-                      <a:off x="0" y="0"/>
-                      <a:ext cx="5580000" cy="2471535"/>
-                    </a:xfrm>
-                    <a:prstGeom prst="rect"/>
-                  </pic:spPr>
-                </pic:pic>
-              </a:graphicData>
-            </a:graphic>
-          </wp:inline>
-        </w:drawing>
-      </w:r>
-    </w:p>
-    <w:p>
-      <w:pPr>
-        <w:keepLines/>
-        <w:spacing w:line="240" w:lineRule="auto" w:before="100" w:after="400"/>
-        <w:jc w:val="center"/>
-      </w:pPr>
-      <w:r>
-        <w:rPr>
-          <w:rFonts w:ascii="Times New Roman" w:hAnsi="Times New Roman" w:cs="Times New Roman" w:eastAsia="Times New Roman"/>
-          <w:b/>
-          <w:sz w:val="24"/>
-        </w:rPr>
-        <w:t>Figure 12.</w:t>
-      </w:r>
-      <w:r>
-        <w:rPr>
-          <w:rFonts w:ascii="Times New Roman" w:hAnsi="Times New Roman" w:cs="Times New Roman" w:eastAsia="Times New Roman"/>
-          <w:sz w:val="24"/>
-        </w:rPr>
-        <w:t xml:space="preserve"> (a) Incremental AUC of each modality over the cheap-only model at 12, 24 and 36 months on a fixed subject set (95% CI); tau-PET omitted as underpowered. (b) The same quantity on subjects matched to each modality; the all-four estimate rises from +0.047 at 12 months to +0.121 at 36 months. Both panels use the 12-measure MRI block.</w:t>
+        <w:t>A secondary analysis asked whether modality value depends on the prediction horizon, which would motivate horizon-conditioned policies. It uses the same 12-measure MRI block. On a fixed subject set, amyloid-PET and CSF showed a significant increase in incremental value from 12 to 36 months (+0.049, 95% CI +0.021 to +0.080, and +0.040, 95% CI +0.010 to +0.068); MRI and FDG did not (tau-PET, flagged underpowered, also increased). A horizon-conditioned policy built on this effect did not outperform horizon-swapped controls: the effect is real as a measurement but not exploitable as an acquisition rule at this sample size (Supplementary Figure S3).</w:t>
       </w:r>
     </w:p>
     <w:p>
@@ -9345,7 +8889,7 @@
           <w:rFonts w:ascii="Times New Roman" w:hAnsi="Times New Roman" w:cs="Times New Roman" w:eastAsia="Times New Roman"/>
           <w:sz w:val="24"/>
         </w:rPr>
-        <w:t>The three policies are re-implementations from published descriptions, as no public code exists for any of them; a negative result about a re-implementation is weaker evidence than one about original code, and we state this plainly. Sample sizes are modest – 67 converters in the 24-month development cohort and 17 in its test set – so several non-significant comparisons are underpowered, and “not distinguishable” should not be read as “equivalent”. Random acquisition is matched to each policy by expected cost, not as a strict fixed budget: the matched rate is derived from the policy’s mean cost, and a policy’s per-patient cost can differ from random acquisition’s even when the means agree (Section 3.6). Comparisons against cost-matched random are Holm-adjusted within each horizon and cost regime (families of 13), but not across horizons and regimes together, and comparisons against acquire-all are unadjusted. In the proposed configuration, different acquisition states are fitted on different, overlapping subject sets, so part of the gain may reflect which subjects each state was trained on, and one FreeSurfer table treats a month-3 scan as baseline-equivalent. The held-out test set was scored on two ADNI data releases (Section 3.2) with unchanged code, so it cannot be treated as untouched with respect to the first. Acquisition costs are relative units whose absolute values are contestable, which is why every cost-dependent conclusion is reported across three regimes. ADNI’s missingness is protocol-driven rather than random, so any retrospective estimate of what could have been skipped is a simulation and not a prospective guarantee. MRI morphometry pools several FreeSurfer pipeline versions, and the results come from a single cohort without external validation.</w:t>
+        <w:t>The three policies are re-implementations from published descriptions, as no public code exists for any of them, so a negative result is weaker evidence than one about original code. Sample sizes are modest (67 converters in the 24-month development cohort, 17 in its test set), so several non-significant comparisons are underpowered and “not distinguishable” should not be read as “equivalent”. Random acquisition is matched by expected cost, not as a strict fixed budget, and per-patient cost can differ from random’s even when the means agree (Section 3.6). Comparisons against cost-matched random are Holm-adjusted within each horizon and regime (families of 13) but not across them, and comparisons against acquire-all are unadjusted. In SPFA, different acquisition states are fitted on different, overlapping subject sets, so part of the gain may reflect which subjects each state was trained on, and one FreeSurfer table treats a month-3 scan as baseline-equivalent. The held-out test set was scored on two ADNI data releases (Section 3.2) and so is not untouched with respect to the first. Acquisition costs are relative units whose absolute values are contestable, hence the three regimes. ADNI’s missingness is protocol-driven rather than random, so retrospective estimates of what could have been skipped are simulations, not prospective guarantees. MRI morphometry pools several FreeSurfer pipeline versions, and the results come from a single cohort without external validation.</w:t>
       </w:r>
     </w:p>
     <w:p>
@@ -9586,7 +9130,7 @@
         </w:rPr>
         <w:t xml:space="preserve">(1), 18–31. </w:t>
       </w:r>
-      <w:hyperlink r:id="rId27" w:history="1">
+      <w:hyperlink r:id="rId22" w:history="1">
         <w:r>
           <w:rPr>
             <w:rStyle w:val="Hyperlink"/>
@@ -9642,7 +9186,7 @@
         </w:rPr>
         <w:t xml:space="preserve"> [Preprint]. arXiv. </w:t>
       </w:r>
-      <w:hyperlink r:id="rId28" w:history="1">
+      <w:hyperlink r:id="rId23" w:history="1">
         <w:r>
           <w:rPr>
             <w:rStyle w:val="Hyperlink"/>
@@ -9698,7 +9242,7 @@
         </w:rPr>
         <w:t xml:space="preserve"> (pp. 108–116). ACM. </w:t>
       </w:r>
-      <w:hyperlink r:id="rId29" w:history="1">
+      <w:hyperlink r:id="rId24" w:history="1">
         <w:r>
           <w:rPr>
             <w:rStyle w:val="Hyperlink"/>
@@ -9754,7 +9298,7 @@
         </w:rPr>
         <w:t xml:space="preserve"> (pp. 7740–7748). IJCAI. </w:t>
       </w:r>
-      <w:hyperlink r:id="rId30" w:history="1">
+      <w:hyperlink r:id="rId25" w:history="1">
         <w:r>
           <w:rPr>
             <w:rStyle w:val="Hyperlink"/>
@@ -9810,7 +9354,7 @@
         </w:rPr>
         <w:t xml:space="preserve"> (pp. 9765–9776). ACM. </w:t>
       </w:r>
-      <w:hyperlink r:id="rId31" w:history="1">
+      <w:hyperlink r:id="rId26" w:history="1">
         <w:r>
           <w:rPr>
             <w:rStyle w:val="Hyperlink"/>
@@ -9866,7 +9410,7 @@
         </w:rPr>
         <w:t xml:space="preserve"> [Preprint]. arXiv. </w:t>
       </w:r>
-      <w:hyperlink r:id="rId32" w:history="1">
+      <w:hyperlink r:id="rId27" w:history="1">
         <w:r>
           <w:rPr>
             <w:rStyle w:val="Hyperlink"/>
@@ -9922,7 +9466,7 @@
         </w:rPr>
         <w:t xml:space="preserve"> [Preprint]. arXiv. </w:t>
       </w:r>
-      <w:hyperlink r:id="rId33" w:history="1">
+      <w:hyperlink r:id="rId28" w:history="1">
         <w:r>
           <w:rPr>
             <w:rStyle w:val="Hyperlink"/>
@@ -9978,7 +9522,7 @@
         </w:rPr>
         <w:t xml:space="preserve"> [Preprint]. arXiv. </w:t>
       </w:r>
-      <w:hyperlink r:id="rId34" w:history="1">
+      <w:hyperlink r:id="rId29" w:history="1">
         <w:r>
           <w:rPr>
             <w:rStyle w:val="Hyperlink"/>
@@ -10034,7 +9578,7 @@
         </w:rPr>
         <w:t xml:space="preserve">. Springer. </w:t>
       </w:r>
-      <w:hyperlink r:id="rId35" w:history="1">
+      <w:hyperlink r:id="rId30" w:history="1">
         <w:r>
           <w:rPr>
             <w:rStyle w:val="Hyperlink"/>
@@ -10090,7 +9634,7 @@
         </w:rPr>
         <w:t xml:space="preserve">, Article 55. </w:t>
       </w:r>
-      <w:hyperlink r:id="rId36" w:history="1">
+      <w:hyperlink r:id="rId31" w:history="1">
         <w:r>
           <w:rPr>
             <w:rStyle w:val="Hyperlink"/>
@@ -10146,7 +9690,7 @@
         </w:rPr>
         <w:t xml:space="preserve"> (pp. 160–168). Springer. </w:t>
       </w:r>
-      <w:hyperlink r:id="rId37" w:history="1">
+      <w:hyperlink r:id="rId32" w:history="1">
         <w:r>
           <w:rPr>
             <w:rStyle w:val="Hyperlink"/>
@@ -10202,7 +9746,7 @@
         </w:rPr>
         <w:t xml:space="preserve">(18), Article 2348. </w:t>
       </w:r>
-      <w:hyperlink r:id="rId38" w:history="1">
+      <w:hyperlink r:id="rId33" w:history="1">
         <w:r>
           <w:rPr>
             <w:rStyle w:val="Hyperlink"/>
@@ -10258,7 +9802,7 @@
         </w:rPr>
         <w:t xml:space="preserve">, Article 101694. </w:t>
       </w:r>
-      <w:hyperlink r:id="rId39" w:history="1">
+      <w:hyperlink r:id="rId34" w:history="1">
         <w:r>
           <w:rPr>
             <w:rStyle w:val="Hyperlink"/>
@@ -10314,7 +9858,7 @@
         </w:rPr>
         <w:t xml:space="preserve">(11), Article e2342203. </w:t>
       </w:r>
-      <w:hyperlink r:id="rId40" w:history="1">
+      <w:hyperlink r:id="rId35" w:history="1">
         <w:r>
           <w:rPr>
             <w:rStyle w:val="Hyperlink"/>
@@ -10415,7 +9959,7 @@
         </w:rPr>
         <w:t xml:space="preserve">(1), 289–300. </w:t>
       </w:r>
-      <w:hyperlink r:id="rId41" w:history="1">
+      <w:hyperlink r:id="rId36" w:history="1">
         <w:r>
           <w:rPr>
             <w:rStyle w:val="Hyperlink"/>
@@ -10471,7 +10015,7 @@
         </w:rPr>
         <w:t xml:space="preserve">(6), 565–574. </w:t>
       </w:r>
-      <w:hyperlink r:id="rId42" w:history="1">
+      <w:hyperlink r:id="rId37" w:history="1">
         <w:r>
           <w:rPr>
             <w:rStyle w:val="Hyperlink"/>
@@ -10524,7 +10068,7 @@
               <w:drawing>
                 <wp:inline xmlns:a="http://schemas.openxmlformats.org/drawingml/2006/main" xmlns:pic="http://schemas.openxmlformats.org/drawingml/2006/picture">
                   <wp:extent cx="792000" cy="1056000"/>
-                  <wp:docPr id="13" name="Picture 13"/>
+                  <wp:docPr id="8" name="Picture 8"/>
                   <wp:cNvGraphicFramePr>
                     <a:graphicFrameLocks noChangeAspect="1"/>
                   </wp:cNvGraphicFramePr>
@@ -10536,7 +10080,7 @@
                           <pic:cNvPicPr/>
                         </pic:nvPicPr>
                         <pic:blipFill>
-                          <a:blip r:embed="rId43"/>
+                          <a:blip r:embed="rId38"/>
                           <a:stretch>
                             <a:fillRect/>
                           </a:stretch>
@@ -10617,7 +10161,7 @@
               <w:drawing>
                 <wp:inline xmlns:a="http://schemas.openxmlformats.org/drawingml/2006/main" xmlns:pic="http://schemas.openxmlformats.org/drawingml/2006/picture">
                   <wp:extent cx="792000" cy="1056000"/>
-                  <wp:docPr id="14" name="Picture 14"/>
+                  <wp:docPr id="9" name="Picture 9"/>
                   <wp:cNvGraphicFramePr>
                     <a:graphicFrameLocks noChangeAspect="1"/>
                   </wp:cNvGraphicFramePr>
@@ -10629,7 +10173,7 @@
                           <pic:cNvPicPr/>
                         </pic:nvPicPr>
                         <pic:blipFill>
-                          <a:blip r:embed="rId44"/>
+                          <a:blip r:embed="rId39"/>
                           <a:stretch>
                             <a:fillRect/>
                           </a:stretch>
@@ -10710,7 +10254,7 @@
               <w:drawing>
                 <wp:inline xmlns:a="http://schemas.openxmlformats.org/drawingml/2006/main" xmlns:pic="http://schemas.openxmlformats.org/drawingml/2006/picture">
                   <wp:extent cx="792000" cy="1056000"/>
-                  <wp:docPr id="15" name="Picture 15"/>
+                  <wp:docPr id="10" name="Picture 10"/>
                   <wp:cNvGraphicFramePr>
                     <a:graphicFrameLocks noChangeAspect="1"/>
                   </wp:cNvGraphicFramePr>
@@ -10722,7 +10266,7 @@
                           <pic:cNvPicPr/>
                         </pic:nvPicPr>
                         <pic:blipFill>
-                          <a:blip r:embed="rId45"/>
+                          <a:blip r:embed="rId40"/>
                           <a:stretch>
                             <a:fillRect/>
                           </a:stretch>
@@ -10818,7 +10362,7 @@
               <w:drawing>
                 <wp:inline xmlns:a="http://schemas.openxmlformats.org/drawingml/2006/main" xmlns:pic="http://schemas.openxmlformats.org/drawingml/2006/picture">
                   <wp:extent cx="792000" cy="1056000"/>
-                  <wp:docPr id="16" name="Picture 16"/>
+                  <wp:docPr id="11" name="Picture 11"/>
                   <wp:cNvGraphicFramePr>
                     <a:graphicFrameLocks noChangeAspect="1"/>
                   </wp:cNvGraphicFramePr>
@@ -10830,7 +10374,7 @@
                           <pic:cNvPicPr/>
                         </pic:nvPicPr>
                         <pic:blipFill>
-                          <a:blip r:embed="rId46"/>
+                          <a:blip r:embed="rId41"/>
                           <a:stretch>
                             <a:fillRect/>
                           </a:stretch>

</xml_diff>

<commit_message>
Manuscript: explicit cost percentages, SPFA framing, re-implementation caveat, Table 5 rounding
Co-Authored-By: Claude Sonnet 5.5 <noreply@anthropic.com>
</commit_message>
<xml_diff>
--- a/paper/TCSST_manuscript_corrected.docx
+++ b/paper/TCSST_manuscript_corrected.docx
@@ -345,7 +345,7 @@
           <w:rFonts w:ascii="Times New Roman" w:hAnsi="Times New Roman" w:cs="Times New Roman" w:eastAsia="Times New Roman"/>
           <w:sz w:val="24"/>
         </w:rPr>
-        <w:t xml:space="preserve">Adaptive modality-acquisition policies promise to cut the cost of Alzheimer’s disease prognosis by deciding, per patient, which scan to order, but to our knowledge none has been compared with the others or with the trivial baselines that any cost-saving claim must beat. We re-implemented three published policies (an uncertainty-gated cascade, a staged evidential method and a reinforcement-learning test-ordering policy) as nine configurations under one leakage-free protocol, using 1,566 participants with mild cognitive impairment from the Alzheimer’s Disease Neuroimaging Initiative (ADNI) and conversion outcomes at 12, 24 and 36 months. Against random acquisition at the same expected cost, 25 of 27 configuration-horizon pairs showed no significant difference after Holm correction under price-like costs (one better, one worse), and 19 of 27 were dominated by a patient-independent fixed rule costing no more. A fixed rule using expanded structural magnetic resonance imaging (MRI) features and training on partially observed participants (signature-pooled fixed acquisition, SPFA) beat cost-matched random acquisition at its MRI-only operating point (area under the receiver operating characteristic curve, AUC, +0.056 and +0.046 at 24 and 36 months; Holm-adjusted </w:t>
+        <w:t xml:space="preserve">Adaptive modality-acquisition policies promise to cut the cost of Alzheimer’s disease prognosis by deciding, per patient, which scan to order, but to our knowledge none has been compared with the others or with the trivial baselines that any cost-saving claim must beat. We re-implemented three published policies (uncertainty-gated, staged evidential and reinforcement-learning) from their descriptions under one leakage-free protocol, using 1,566 participants with mild cognitive impairment from the Alzheimer’s Disease Neuroimaging Initiative (ADNI) and conversion outcomes at 12, 24 and 36 months; they are not exact reproductions. Against random acquisition at the same expected cost, 25 of 27 configuration-horizon pairs showed no significant difference after Holm correction under price-like costs (one better, one worse), and 19 of 27 were dominated by a patient-independent fixed rule costing no more. Signature-pooled fixed acquisition (SPFA) is not a new decision rule: it gives every patient the same tests, using expanded structural magnetic resonance imaging (MRI) features and training on partially observed participants. At its MRI-only operating point it beat cost-matched random acquisition (area under the receiver operating characteristic curve, AUC, +0.056 and +0.046 at 24 and 36 months; Holm-adjusted </w:t>
       </w:r>
       <m:oMath>
         <m:r>
@@ -366,7 +366,7 @@
           <w:rFonts w:ascii="Times New Roman" w:hAnsi="Times New Roman" w:cs="Times New Roman" w:eastAsia="Times New Roman"/>
           <w:sz w:val="24"/>
         </w:rPr>
-        <w:t xml:space="preserve"> and 0.016) and showed no significant AUC difference from acquiring all four modalities at one-third to one-tenth of the cost, except for MRI-only at 36 months in development. The held-out test set, scored on two successive data releases (the second is reported), is small and cannot establish equivalence. Complete-case analysis reduced non-White representation from 14.2% to 5.9%, making race-stratified fairness auditing infeasible.</w:t>
+        <w:t xml:space="preserve"> and 0.016) and showed no significant AUC difference from acquiring all four modalities at about 11% to 32% of the price-like acquisition cost, except for MRI-only at 36 months in development. The small held-out test set, scored on two data releases (the second is reported), cannot establish equivalence. Complete-case analysis reduced non-White representation from 14.2% to 5.9%, making race-stratified fairness auditing infeasible.</w:t>
       </w:r>
     </w:p>
     <w:p>
@@ -596,7 +596,7 @@
           <w:rFonts w:ascii="Times New Roman" w:hAnsi="Times New Roman" w:cs="Times New Roman" w:eastAsia="Times New Roman"/>
           <w:sz w:val="24"/>
         </w:rPr>
-        <w:t>We report a largely negative result, and one constructive consequence of it. We are explicit throughout about which findings are new and which reproduce established results in a new setting.</w:t>
+        <w:t>We report a largely negative result, and one constructive consequence of it: SPFA, a fixed rule built from two existing ideas, is offered as a baseline for the benchmark, not as a new acquisition algorithm. We are explicit throughout about which findings are new and which reproduce established results in a new setting.</w:t>
       </w:r>
     </w:p>
     <w:p>
@@ -7221,7 +7221,7 @@
           <w:rFonts w:ascii="Times New Roman" w:hAnsi="Times New Roman" w:cs="Times New Roman" w:eastAsia="Times New Roman"/>
           <w:sz w:val="24"/>
         </w:rPr>
-        <w:t>If the savings these policies chase do not require a policy, they should be obtainable directly. Table 4 gives the nested cross-validated AUC of SPFA, which combines the expanded MRI block [10] with training each acquisition state on every participant who holds it rather than on complete cases only [11]. Neither ingredient is novel; their use as the baseline against which adaptive policies are measured is. Cost ratios refer to acquire-all (9.5 price-like units): 9.5 for MRI-only and 3.2 for MRI+FDG.</w:t>
+        <w:t>If the savings these policies chase do not require a policy, they should be obtainable directly. Table 4 gives the nested cross-validated AUC of SPFA, which combines the expanded MRI block [10] with training each acquisition state on every participant who holds it rather than on complete cases only [11]. Neither ingredient is novel; their use as the baseline against which adaptive policies are measured is. Under price-like costs SPFA costs 1.0 (MRI only) and 3.0 (MRI+FDG) units against 9.5 for acquire-all, about 11% and 32% of the acquisition cost (25% and 50% under flat costs; 7% and 29% under burden costs).</w:t>
       </w:r>
     </w:p>
     <w:p>
@@ -7942,7 +7942,7 @@
                 <w:rFonts w:ascii="Times New Roman" w:hAnsi="Times New Roman" w:cs="Times New Roman" w:eastAsia="Times New Roman"/>
                 <w:sz w:val="20"/>
               </w:rPr>
-              <w:t>−0.002 (−0.055, +0.059)</w:t>
+              <w:t>−0.003 (−0.055, +0.059)</w:t>
             </w:r>
           </w:p>
         </w:tc>
@@ -8930,7 +8930,7 @@
           <w:rFonts w:ascii="Times New Roman" w:hAnsi="Times New Roman" w:cs="Times New Roman" w:eastAsia="Times New Roman"/>
           <w:sz w:val="24"/>
         </w:rPr>
-        <w:t>Consistent with this, SPFA, built from two existing ideas – an expanded set of structural MRI features and training on partially observed participants – beat cost-matched random acquisition at its MRI-only operating point at 24 and 36 months, and showed no significant AUC difference from acquiring four modalities at about one-third to one-tenth of the acquisition cost, with the caveats that its cheapest operating point was significantly lower at the 36-month horizon in development and that the small test set cannot establish equivalence.</w:t>
+        <w:t>Consistent with this, SPFA, built from two existing ideas – an expanded set of structural MRI features and training on partially observed participants – beat cost-matched random acquisition at its MRI-only operating point at 24 and 36 months, and showed no significant AUC difference from acquiring four modalities at about 11% to 32% of the price-like acquisition cost, with the caveats that its cheapest operating point was significantly lower at the 36-month horizon in development, that the small test sets (scored on two data releases) cannot establish equivalence, and that SPFA is a baseline built from existing ideas, not a new acquisition algorithm.</w:t>
       </w:r>
     </w:p>
     <w:p>

</xml_diff>